<commit_message>
Mail trap mail send doc
</commit_message>
<xml_diff>
--- a/FinalProject/Final_project_doc/9 Email Sending.docx
+++ b/FinalProject/Final_project_doc/9 Email Sending.docx
@@ -2376,8 +2376,1601 @@
       <w:r>
         <w:br/>
       </w:r>
-      <w:bookmarkEnd w:id="0"/>
-    </w:p>
+    </w:p>
+    <w:p>
+      <w:pPr>
+        <w:pStyle w:val="Heading2"/>
+      </w:pPr>
+      <w:r>
+        <w:t>86. Authenticated Password Change Workflow &amp; Session Revocation (Notes)</w:t>
+      </w:r>
+    </w:p>
+    <w:p>
+      <w:pPr>
+        <w:pStyle w:val="NormalWeb"/>
+        <w:numPr>
+          <w:ilvl w:val="0"/>
+          <w:numId w:val="20"/>
+        </w:numPr>
+      </w:pPr>
+      <w:r>
+        <w:rPr>
+          <w:b/>
+          <w:bCs/>
+        </w:rPr>
+        <w:t>Purpose:</w:t>
+      </w:r>
+      <w:r>
+        <w:t xml:space="preserve"> Implement a secure, in-session credential update pipeline that validates existing ownership via current password verification, enforces duplicate password restrictions, commits salted cryptographic hashes, and invalidates active refresh tokens across secondary devices.</w:t>
+      </w:r>
+    </w:p>
+    <w:p>
+      <w:pPr>
+        <w:pStyle w:val="Heading3"/>
+      </w:pPr>
+      <w:r>
+        <w:t>The 9-Step Authenticated Password Change Architecture</w:t>
+      </w:r>
+    </w:p>
+    <w:p>
+      <w:pPr>
+        <w:pStyle w:val="NormalWeb"/>
+        <w:numPr>
+          <w:ilvl w:val="0"/>
+          <w:numId w:val="21"/>
+        </w:numPr>
+      </w:pPr>
+      <w:r>
+        <w:rPr>
+          <w:b/>
+          <w:bCs/>
+        </w:rPr>
+        <w:t>Step 1: Entry Point &amp; Route Protection (Frontend):</w:t>
+      </w:r>
+    </w:p>
+    <w:p>
+      <w:pPr>
+        <w:pStyle w:val="NormalWeb"/>
+        <w:numPr>
+          <w:ilvl w:val="1"/>
+          <w:numId w:val="21"/>
+        </w:numPr>
+      </w:pPr>
+      <w:r>
+        <w:t>Accessible exclusively to authenticated users navigating via the User Panel Sidebar (</w:t>
+      </w:r>
+      <w:r>
+        <w:rPr>
+          <w:rStyle w:val="HTMLCode"/>
+          <w:rFonts w:eastAsiaTheme="majorEastAsia"/>
+        </w:rPr>
+        <w:t>/user/change-password</w:t>
+      </w:r>
+      <w:r>
+        <w:t>).</w:t>
+      </w:r>
+    </w:p>
+    <w:p>
+      <w:pPr>
+        <w:pStyle w:val="NormalWeb"/>
+        <w:numPr>
+          <w:ilvl w:val="1"/>
+          <w:numId w:val="21"/>
+        </w:numPr>
+      </w:pPr>
+      <w:r>
+        <w:t xml:space="preserve">Wrapped within </w:t>
+      </w:r>
+      <w:r>
+        <w:rPr>
+          <w:rStyle w:val="HTMLCode"/>
+          <w:rFonts w:eastAsiaTheme="majorEastAsia"/>
+        </w:rPr>
+        <w:t>&lt;ProtectedRoute&gt;</w:t>
+      </w:r>
+      <w:r>
+        <w:t xml:space="preserve"> to prevent unauthenticated access and automatically bounce unauthorized visitors to </w:t>
+      </w:r>
+      <w:r>
+        <w:rPr>
+          <w:rStyle w:val="HTMLCode"/>
+          <w:rFonts w:eastAsiaTheme="majorEastAsia"/>
+        </w:rPr>
+        <w:t>/login</w:t>
+      </w:r>
+      <w:r>
+        <w:t>.</w:t>
+      </w:r>
+    </w:p>
+    <w:p>
+      <w:pPr>
+        <w:pStyle w:val="NormalWeb"/>
+        <w:numPr>
+          <w:ilvl w:val="0"/>
+          <w:numId w:val="21"/>
+        </w:numPr>
+      </w:pPr>
+      <w:r>
+        <w:rPr>
+          <w:b/>
+          <w:bCs/>
+        </w:rPr>
+        <w:t>Step 2: Form Input &amp; Client-Side Pre-flight Validation (Frontend):</w:t>
+      </w:r>
+    </w:p>
+    <w:p>
+      <w:pPr>
+        <w:pStyle w:val="NormalWeb"/>
+        <w:numPr>
+          <w:ilvl w:val="1"/>
+          <w:numId w:val="21"/>
+        </w:numPr>
+      </w:pPr>
+      <w:r>
+        <w:t xml:space="preserve">Collects </w:t>
+      </w:r>
+      <w:r>
+        <w:rPr>
+          <w:rStyle w:val="HTMLCode"/>
+          <w:rFonts w:eastAsiaTheme="majorEastAsia"/>
+        </w:rPr>
+        <w:t>old_password</w:t>
+      </w:r>
+      <w:r>
+        <w:t xml:space="preserve">, </w:t>
+      </w:r>
+      <w:r>
+        <w:rPr>
+          <w:rStyle w:val="HTMLCode"/>
+          <w:rFonts w:eastAsiaTheme="majorEastAsia"/>
+        </w:rPr>
+        <w:t>new_password</w:t>
+      </w:r>
+      <w:r>
+        <w:t xml:space="preserve">, and </w:t>
+      </w:r>
+      <w:r>
+        <w:rPr>
+          <w:rStyle w:val="HTMLCode"/>
+          <w:rFonts w:eastAsiaTheme="majorEastAsia"/>
+        </w:rPr>
+        <w:t>confirm_new_password</w:t>
+      </w:r>
+      <w:r>
+        <w:t>.</w:t>
+      </w:r>
+    </w:p>
+    <w:p>
+      <w:pPr>
+        <w:pStyle w:val="NormalWeb"/>
+        <w:numPr>
+          <w:ilvl w:val="1"/>
+          <w:numId w:val="21"/>
+        </w:numPr>
+      </w:pPr>
+      <w:r>
+        <w:t>Evaluates input parity (</w:t>
+      </w:r>
+      <w:r>
+        <w:rPr>
+          <w:rStyle w:val="HTMLCode"/>
+          <w:rFonts w:eastAsiaTheme="majorEastAsia"/>
+        </w:rPr>
+        <w:t>new_password === confirm_new_password</w:t>
+      </w:r>
+      <w:r>
+        <w:t>) client-side prior to network dispatch to catch typos early and eliminate unnecessary API round-trips.</w:t>
+      </w:r>
+    </w:p>
+    <w:p>
+      <w:pPr>
+        <w:pStyle w:val="NormalWeb"/>
+        <w:numPr>
+          <w:ilvl w:val="0"/>
+          <w:numId w:val="21"/>
+        </w:numPr>
+      </w:pPr>
+      <w:r>
+        <w:rPr>
+          <w:b/>
+          <w:bCs/>
+        </w:rPr>
+        <w:t>Step 3: Authenticated Dispatch via HTTP-Only Cookies (Frontend):</w:t>
+      </w:r>
+    </w:p>
+    <w:p>
+      <w:pPr>
+        <w:pStyle w:val="NormalWeb"/>
+        <w:numPr>
+          <w:ilvl w:val="1"/>
+          <w:numId w:val="21"/>
+        </w:numPr>
+      </w:pPr>
+      <w:r>
+        <w:t xml:space="preserve">Dispatches </w:t>
+      </w:r>
+      <w:r>
+        <w:rPr>
+          <w:rStyle w:val="HTMLCode"/>
+          <w:rFonts w:eastAsiaTheme="majorEastAsia"/>
+        </w:rPr>
+        <w:t>POST /api/account/change-password</w:t>
+      </w:r>
+      <w:r>
+        <w:t xml:space="preserve"> through the centralized Axios client instance (</w:t>
+      </w:r>
+      <w:r>
+        <w:rPr>
+          <w:rStyle w:val="HTMLCode"/>
+          <w:rFonts w:eastAsiaTheme="majorEastAsia"/>
+        </w:rPr>
+        <w:t>api</w:t>
+      </w:r>
+      <w:r>
+        <w:t>).</w:t>
+      </w:r>
+    </w:p>
+    <w:p>
+      <w:pPr>
+        <w:pStyle w:val="NormalWeb"/>
+        <w:numPr>
+          <w:ilvl w:val="1"/>
+          <w:numId w:val="21"/>
+        </w:numPr>
+      </w:pPr>
+      <w:r>
+        <w:t xml:space="preserve">Authentication is handled automatically via browser-managed HTTP-Only </w:t>
+      </w:r>
+      <w:r>
+        <w:rPr>
+          <w:rStyle w:val="HTMLCode"/>
+          <w:rFonts w:eastAsiaTheme="majorEastAsia"/>
+        </w:rPr>
+        <w:t>access_token</w:t>
+      </w:r>
+      <w:r>
+        <w:t xml:space="preserve"> cookies with </w:t>
+      </w:r>
+      <w:r>
+        <w:rPr>
+          <w:rStyle w:val="HTMLCode"/>
+          <w:rFonts w:eastAsiaTheme="majorEastAsia"/>
+        </w:rPr>
+        <w:t>credentials: "include"</w:t>
+      </w:r>
+      <w:r>
+        <w:t>.</w:t>
+      </w:r>
+    </w:p>
+    <w:p>
+      <w:pPr>
+        <w:pStyle w:val="NormalWeb"/>
+        <w:numPr>
+          <w:ilvl w:val="1"/>
+          <w:numId w:val="21"/>
+        </w:numPr>
+      </w:pPr>
+      <w:r>
+        <w:t>Request payload includes:</w:t>
+      </w:r>
+    </w:p>
+    <w:p>
+      <w:pPr>
+        <w:spacing w:beforeAutospacing="1" w:afterAutospacing="1"/>
+        <w:ind w:left="1440"/>
+      </w:pPr>
+      <w:r>
+        <w:rPr>
+          <w:rStyle w:val="ng-tns-c3089768999-247"/>
+        </w:rPr>
+        <w:t>JSON</w:t>
+      </w:r>
+    </w:p>
+    <w:p>
+      <w:pPr>
+        <w:pStyle w:val="HTMLPreformatted"/>
+        <w:ind w:left="1440"/>
+        <w:rPr>
+          <w:rStyle w:val="HTMLCode"/>
+          <w:rFonts w:eastAsiaTheme="majorEastAsia"/>
+        </w:rPr>
+      </w:pPr>
+      <w:r>
+        <w:rPr>
+          <w:rStyle w:val="HTMLCode"/>
+          <w:rFonts w:eastAsiaTheme="majorEastAsia"/>
+        </w:rPr>
+        <w:t>{</w:t>
+      </w:r>
+    </w:p>
+    <w:p>
+      <w:pPr>
+        <w:pStyle w:val="HTMLPreformatted"/>
+        <w:ind w:left="1440"/>
+        <w:rPr>
+          <w:rStyle w:val="HTMLCode"/>
+          <w:rFonts w:eastAsiaTheme="majorEastAsia"/>
+        </w:rPr>
+      </w:pPr>
+      <w:r>
+        <w:rPr>
+          <w:rStyle w:val="HTMLCode"/>
+          <w:rFonts w:eastAsiaTheme="majorEastAsia"/>
+        </w:rPr>
+        <w:t xml:space="preserve">  </w:t>
+      </w:r>
+      <w:r>
+        <w:rPr>
+          <w:rStyle w:val="hljs-attr"/>
+        </w:rPr>
+        <w:t>"old_password"</w:t>
+      </w:r>
+      <w:r>
+        <w:rPr>
+          <w:rStyle w:val="HTMLCode"/>
+          <w:rFonts w:eastAsiaTheme="majorEastAsia"/>
+        </w:rPr>
+        <w:t xml:space="preserve">: </w:t>
+      </w:r>
+      <w:r>
+        <w:rPr>
+          <w:rStyle w:val="hljs-string"/>
+        </w:rPr>
+        <w:t>"CurrentPassword123!"</w:t>
+      </w:r>
+      <w:r>
+        <w:rPr>
+          <w:rStyle w:val="HTMLCode"/>
+          <w:rFonts w:eastAsiaTheme="majorEastAsia"/>
+        </w:rPr>
+        <w:t>,</w:t>
+      </w:r>
+    </w:p>
+    <w:p>
+      <w:pPr>
+        <w:pStyle w:val="HTMLPreformatted"/>
+        <w:ind w:left="1440"/>
+        <w:rPr>
+          <w:rStyle w:val="HTMLCode"/>
+          <w:rFonts w:eastAsiaTheme="majorEastAsia"/>
+        </w:rPr>
+      </w:pPr>
+      <w:r>
+        <w:rPr>
+          <w:rStyle w:val="HTMLCode"/>
+          <w:rFonts w:eastAsiaTheme="majorEastAsia"/>
+        </w:rPr>
+        <w:t xml:space="preserve">  </w:t>
+      </w:r>
+      <w:r>
+        <w:rPr>
+          <w:rStyle w:val="hljs-attr"/>
+        </w:rPr>
+        <w:t>"new_password"</w:t>
+      </w:r>
+      <w:r>
+        <w:rPr>
+          <w:rStyle w:val="HTMLCode"/>
+          <w:rFonts w:eastAsiaTheme="majorEastAsia"/>
+        </w:rPr>
+        <w:t xml:space="preserve">: </w:t>
+      </w:r>
+      <w:r>
+        <w:rPr>
+          <w:rStyle w:val="hljs-string"/>
+        </w:rPr>
+        <w:t>"NewSecurePassword456!"</w:t>
+      </w:r>
+    </w:p>
+    <w:p>
+      <w:pPr>
+        <w:pStyle w:val="HTMLPreformatted"/>
+        <w:ind w:left="1440"/>
+        <w:rPr>
+          <w:rStyle w:val="HTMLCode"/>
+          <w:rFonts w:eastAsiaTheme="majorEastAsia"/>
+        </w:rPr>
+      </w:pPr>
+      <w:r>
+        <w:rPr>
+          <w:rStyle w:val="HTMLCode"/>
+          <w:rFonts w:eastAsiaTheme="majorEastAsia"/>
+        </w:rPr>
+        <w:t>}</w:t>
+      </w:r>
+    </w:p>
+    <w:p>
+      <w:pPr>
+        <w:pStyle w:val="NormalWeb"/>
+        <w:numPr>
+          <w:ilvl w:val="0"/>
+          <w:numId w:val="21"/>
+        </w:numPr>
+      </w:pPr>
+      <w:r>
+        <w:rPr>
+          <w:b/>
+          <w:bCs/>
+        </w:rPr>
+        <w:t>Step 4: Identity Resolution &amp; Schema Validation (Backend):</w:t>
+      </w:r>
+    </w:p>
+    <w:p>
+      <w:pPr>
+        <w:pStyle w:val="NormalWeb"/>
+        <w:numPr>
+          <w:ilvl w:val="1"/>
+          <w:numId w:val="21"/>
+        </w:numPr>
+      </w:pPr>
+      <w:r>
+        <w:t xml:space="preserve">Endpoint resolves the authenticated session using </w:t>
+      </w:r>
+      <w:r>
+        <w:rPr>
+          <w:rStyle w:val="HTMLCode"/>
+          <w:rFonts w:eastAsiaTheme="majorEastAsia"/>
+        </w:rPr>
+        <w:t>user: User = Depends(get_current_user)</w:t>
+      </w:r>
+      <w:r>
+        <w:t>.</w:t>
+      </w:r>
+    </w:p>
+    <w:p>
+      <w:pPr>
+        <w:pStyle w:val="NormalWeb"/>
+        <w:numPr>
+          <w:ilvl w:val="1"/>
+          <w:numId w:val="21"/>
+        </w:numPr>
+      </w:pPr>
+      <w:r>
+        <w:t>Incoming payload is parsed against Pydantic schema (</w:t>
+      </w:r>
+      <w:r>
+        <w:rPr>
+          <w:rStyle w:val="HTMLCode"/>
+          <w:rFonts w:eastAsiaTheme="majorEastAsia"/>
+        </w:rPr>
+        <w:t>PasswordChangeRequest</w:t>
+      </w:r>
+      <w:r>
+        <w:t>), validating length constraints and structure.</w:t>
+      </w:r>
+    </w:p>
+    <w:p>
+      <w:pPr>
+        <w:pStyle w:val="NormalWeb"/>
+        <w:numPr>
+          <w:ilvl w:val="0"/>
+          <w:numId w:val="21"/>
+        </w:numPr>
+      </w:pPr>
+      <w:r>
+        <w:rPr>
+          <w:b/>
+          <w:bCs/>
+        </w:rPr>
+        <w:t>Step 5: Current Password Ownership Verification (Backend):</w:t>
+      </w:r>
+    </w:p>
+    <w:p>
+      <w:pPr>
+        <w:pStyle w:val="NormalWeb"/>
+        <w:numPr>
+          <w:ilvl w:val="1"/>
+          <w:numId w:val="21"/>
+        </w:numPr>
+      </w:pPr>
+      <w:r>
+        <w:lastRenderedPageBreak/>
+        <w:t xml:space="preserve">Verifies the submitted </w:t>
+      </w:r>
+      <w:r>
+        <w:rPr>
+          <w:rStyle w:val="HTMLCode"/>
+          <w:rFonts w:eastAsiaTheme="majorEastAsia"/>
+        </w:rPr>
+        <w:t>old_password</w:t>
+      </w:r>
+      <w:r>
+        <w:t xml:space="preserve"> against the database record using </w:t>
+      </w:r>
+      <w:r>
+        <w:rPr>
+          <w:rStyle w:val="HTMLCode"/>
+          <w:rFonts w:eastAsiaTheme="majorEastAsia"/>
+        </w:rPr>
+        <w:t>pwd_context.verify(data.old_password, user.hashed_password)</w:t>
+      </w:r>
+      <w:r>
+        <w:t>.</w:t>
+      </w:r>
+    </w:p>
+    <w:p>
+      <w:pPr>
+        <w:pStyle w:val="NormalWeb"/>
+        <w:numPr>
+          <w:ilvl w:val="1"/>
+          <w:numId w:val="21"/>
+        </w:numPr>
+      </w:pPr>
+      <w:r>
+        <w:t xml:space="preserve">If verification fails, execution halts immediately with HTTP </w:t>
+      </w:r>
+      <w:r>
+        <w:rPr>
+          <w:rStyle w:val="HTMLCode"/>
+          <w:rFonts w:eastAsiaTheme="majorEastAsia"/>
+        </w:rPr>
+        <w:t>401 Unauthorized</w:t>
+      </w:r>
+      <w:r>
+        <w:t xml:space="preserve"> (</w:t>
+      </w:r>
+      <w:r>
+        <w:rPr>
+          <w:rStyle w:val="HTMLCode"/>
+          <w:rFonts w:eastAsiaTheme="majorEastAsia"/>
+        </w:rPr>
+        <w:t>"Old password is incorrect"</w:t>
+      </w:r>
+      <w:r>
+        <w:t>), preventing unauthorized modifications from shared or unattended physical workstations.</w:t>
+      </w:r>
+    </w:p>
+    <w:p>
+      <w:pPr>
+        <w:pStyle w:val="NormalWeb"/>
+        <w:numPr>
+          <w:ilvl w:val="0"/>
+          <w:numId w:val="21"/>
+        </w:numPr>
+      </w:pPr>
+      <w:r>
+        <w:rPr>
+          <w:b/>
+          <w:bCs/>
+        </w:rPr>
+        <w:t>Step 6: Duplicate Password Policy Enforcement (Backend):</w:t>
+      </w:r>
+    </w:p>
+    <w:p>
+      <w:pPr>
+        <w:pStyle w:val="NormalWeb"/>
+        <w:numPr>
+          <w:ilvl w:val="1"/>
+          <w:numId w:val="21"/>
+        </w:numPr>
+      </w:pPr>
+      <w:r>
+        <w:t>Checks whether the proposed new password matches the existing credential:</w:t>
+      </w:r>
+    </w:p>
+    <w:p>
+      <w:pPr>
+        <w:spacing w:beforeAutospacing="1" w:afterAutospacing="1"/>
+        <w:ind w:left="1440"/>
+      </w:pPr>
+      <w:r>
+        <w:rPr>
+          <w:rStyle w:val="ng-tns-c3089768999-248"/>
+        </w:rPr>
+        <w:t>Python</w:t>
+      </w:r>
+    </w:p>
+    <w:p>
+      <w:pPr>
+        <w:pStyle w:val="HTMLPreformatted"/>
+        <w:ind w:left="1440"/>
+        <w:rPr>
+          <w:rStyle w:val="HTMLCode"/>
+          <w:rFonts w:eastAsiaTheme="majorEastAsia"/>
+        </w:rPr>
+      </w:pPr>
+      <w:r>
+        <w:rPr>
+          <w:rStyle w:val="hljs-keyword"/>
+        </w:rPr>
+        <w:t>if</w:t>
+      </w:r>
+      <w:r>
+        <w:rPr>
+          <w:rStyle w:val="HTMLCode"/>
+          <w:rFonts w:eastAsiaTheme="majorEastAsia"/>
+        </w:rPr>
+        <w:t xml:space="preserve"> data.old_password == data.new_password:</w:t>
+      </w:r>
+    </w:p>
+    <w:p>
+      <w:pPr>
+        <w:pStyle w:val="HTMLPreformatted"/>
+        <w:ind w:left="1440"/>
+        <w:rPr>
+          <w:rStyle w:val="HTMLCode"/>
+          <w:rFonts w:eastAsiaTheme="majorEastAsia"/>
+        </w:rPr>
+      </w:pPr>
+      <w:r>
+        <w:rPr>
+          <w:rStyle w:val="HTMLCode"/>
+          <w:rFonts w:eastAsiaTheme="majorEastAsia"/>
+        </w:rPr>
+        <w:t xml:space="preserve">    </w:t>
+      </w:r>
+      <w:r>
+        <w:rPr>
+          <w:rStyle w:val="hljs-keyword"/>
+        </w:rPr>
+        <w:t>raise</w:t>
+      </w:r>
+      <w:r>
+        <w:rPr>
+          <w:rStyle w:val="HTMLCode"/>
+          <w:rFonts w:eastAsiaTheme="majorEastAsia"/>
+        </w:rPr>
+        <w:t xml:space="preserve"> HTTPException(</w:t>
+      </w:r>
+    </w:p>
+    <w:p>
+      <w:pPr>
+        <w:pStyle w:val="HTMLPreformatted"/>
+        <w:ind w:left="1440"/>
+        <w:rPr>
+          <w:rStyle w:val="HTMLCode"/>
+          <w:rFonts w:eastAsiaTheme="majorEastAsia"/>
+        </w:rPr>
+      </w:pPr>
+      <w:r>
+        <w:rPr>
+          <w:rStyle w:val="HTMLCode"/>
+          <w:rFonts w:eastAsiaTheme="majorEastAsia"/>
+        </w:rPr>
+        <w:t xml:space="preserve">        status_code=status.HTTP_400_BAD_REQUEST, </w:t>
+      </w:r>
+    </w:p>
+    <w:p>
+      <w:pPr>
+        <w:pStyle w:val="HTMLPreformatted"/>
+        <w:ind w:left="1440"/>
+        <w:rPr>
+          <w:rStyle w:val="HTMLCode"/>
+          <w:rFonts w:eastAsiaTheme="majorEastAsia"/>
+        </w:rPr>
+      </w:pPr>
+      <w:r>
+        <w:rPr>
+          <w:rStyle w:val="HTMLCode"/>
+          <w:rFonts w:eastAsiaTheme="majorEastAsia"/>
+        </w:rPr>
+        <w:t xml:space="preserve">        detail=</w:t>
+      </w:r>
+      <w:r>
+        <w:rPr>
+          <w:rStyle w:val="hljs-string"/>
+        </w:rPr>
+        <w:t>"New password cannot be the same as old password"</w:t>
+      </w:r>
+    </w:p>
+    <w:p>
+      <w:pPr>
+        <w:pStyle w:val="HTMLPreformatted"/>
+        <w:ind w:left="1440"/>
+        <w:rPr>
+          <w:rStyle w:val="HTMLCode"/>
+          <w:rFonts w:eastAsiaTheme="majorEastAsia"/>
+        </w:rPr>
+      </w:pPr>
+      <w:r>
+        <w:rPr>
+          <w:rStyle w:val="HTMLCode"/>
+          <w:rFonts w:eastAsiaTheme="majorEastAsia"/>
+        </w:rPr>
+        <w:t xml:space="preserve">    )</w:t>
+      </w:r>
+    </w:p>
+    <w:p>
+      <w:pPr>
+        <w:pStyle w:val="NormalWeb"/>
+        <w:numPr>
+          <w:ilvl w:val="1"/>
+          <w:numId w:val="21"/>
+        </w:numPr>
+      </w:pPr>
+      <w:r>
+        <w:t>Enforces security best practices by requiring genuine credential rotation.</w:t>
+      </w:r>
+    </w:p>
+    <w:p>
+      <w:pPr>
+        <w:pStyle w:val="NormalWeb"/>
+        <w:numPr>
+          <w:ilvl w:val="0"/>
+          <w:numId w:val="21"/>
+        </w:numPr>
+      </w:pPr>
+      <w:r>
+        <w:rPr>
+          <w:b/>
+          <w:bCs/>
+        </w:rPr>
+        <w:t>Step 7: Password Re-Hashing &amp; Database Persistence (Backend):</w:t>
+      </w:r>
+    </w:p>
+    <w:p>
+      <w:pPr>
+        <w:pStyle w:val="NormalWeb"/>
+        <w:numPr>
+          <w:ilvl w:val="1"/>
+          <w:numId w:val="21"/>
+        </w:numPr>
+      </w:pPr>
+      <w:r>
+        <w:t xml:space="preserve">Computes a fresh cryptographic hash using </w:t>
+      </w:r>
+      <w:r>
+        <w:rPr>
+          <w:rStyle w:val="HTMLCode"/>
+          <w:rFonts w:eastAsiaTheme="majorEastAsia"/>
+        </w:rPr>
+        <w:t>pwd_context.hash(data.new_password)</w:t>
+      </w:r>
+      <w:r>
+        <w:t>.</w:t>
+      </w:r>
+    </w:p>
+    <w:p>
+      <w:pPr>
+        <w:pStyle w:val="NormalWeb"/>
+        <w:numPr>
+          <w:ilvl w:val="1"/>
+          <w:numId w:val="21"/>
+        </w:numPr>
+      </w:pPr>
+      <w:r>
+        <w:t xml:space="preserve">Assigns the hash to </w:t>
+      </w:r>
+      <w:r>
+        <w:rPr>
+          <w:rStyle w:val="HTMLCode"/>
+          <w:rFonts w:eastAsiaTheme="majorEastAsia"/>
+        </w:rPr>
+        <w:t>user.hashed_password</w:t>
+      </w:r>
+      <w:r>
+        <w:t xml:space="preserve"> and commits the transaction to MySQL.</w:t>
+      </w:r>
+    </w:p>
+    <w:p>
+      <w:pPr>
+        <w:pStyle w:val="NormalWeb"/>
+        <w:numPr>
+          <w:ilvl w:val="0"/>
+          <w:numId w:val="21"/>
+        </w:numPr>
+      </w:pPr>
+      <w:r>
+        <w:rPr>
+          <w:b/>
+          <w:bCs/>
+        </w:rPr>
+        <w:t>Step 8: Global Refresh Token Revocation (Backend):</w:t>
+      </w:r>
+    </w:p>
+    <w:p>
+      <w:pPr>
+        <w:pStyle w:val="NormalWeb"/>
+        <w:numPr>
+          <w:ilvl w:val="1"/>
+          <w:numId w:val="21"/>
+        </w:numPr>
+      </w:pPr>
+      <w:r>
+        <w:t xml:space="preserve">Executes a bulk update query across the </w:t>
+      </w:r>
+      <w:r>
+        <w:rPr>
+          <w:rStyle w:val="HTMLCode"/>
+          <w:rFonts w:eastAsiaTheme="majorEastAsia"/>
+        </w:rPr>
+        <w:t>refresh_tokens</w:t>
+      </w:r>
+      <w:r>
+        <w:t xml:space="preserve"> table for the user:</w:t>
+      </w:r>
+    </w:p>
+    <w:p>
+      <w:pPr>
+        <w:spacing w:beforeAutospacing="1" w:afterAutospacing="1"/>
+        <w:ind w:left="1440"/>
+      </w:pPr>
+      <w:r>
+        <w:rPr>
+          <w:rStyle w:val="ng-tns-c3089768999-249"/>
+        </w:rPr>
+        <w:t>Python</w:t>
+      </w:r>
+    </w:p>
+    <w:p>
+      <w:pPr>
+        <w:pStyle w:val="HTMLPreformatted"/>
+        <w:ind w:left="1440"/>
+        <w:rPr>
+          <w:rStyle w:val="HTMLCode"/>
+          <w:rFonts w:eastAsiaTheme="majorEastAsia"/>
+        </w:rPr>
+      </w:pPr>
+      <w:r>
+        <w:rPr>
+          <w:rStyle w:val="hljs-keyword"/>
+        </w:rPr>
+        <w:t>await</w:t>
+      </w:r>
+      <w:r>
+        <w:rPr>
+          <w:rStyle w:val="HTMLCode"/>
+          <w:rFonts w:eastAsiaTheme="majorEastAsia"/>
+        </w:rPr>
+        <w:t xml:space="preserve"> session.execute(</w:t>
+      </w:r>
+    </w:p>
+    <w:p>
+      <w:pPr>
+        <w:pStyle w:val="HTMLPreformatted"/>
+        <w:ind w:left="1440"/>
+        <w:rPr>
+          <w:rStyle w:val="HTMLCode"/>
+          <w:rFonts w:eastAsiaTheme="majorEastAsia"/>
+        </w:rPr>
+      </w:pPr>
+      <w:r>
+        <w:rPr>
+          <w:rStyle w:val="HTMLCode"/>
+          <w:rFonts w:eastAsiaTheme="majorEastAsia"/>
+        </w:rPr>
+        <w:t xml:space="preserve">    update(RefreshToken)</w:t>
+      </w:r>
+    </w:p>
+    <w:p>
+      <w:pPr>
+        <w:pStyle w:val="HTMLPreformatted"/>
+        <w:ind w:left="1440"/>
+        <w:rPr>
+          <w:rStyle w:val="HTMLCode"/>
+          <w:rFonts w:eastAsiaTheme="majorEastAsia"/>
+        </w:rPr>
+      </w:pPr>
+      <w:r>
+        <w:rPr>
+          <w:rStyle w:val="HTMLCode"/>
+          <w:rFonts w:eastAsiaTheme="majorEastAsia"/>
+        </w:rPr>
+        <w:t xml:space="preserve">    .where(RefreshToken.user_id == user.</w:t>
+      </w:r>
+      <w:r>
+        <w:rPr>
+          <w:rStyle w:val="hljs-builtin"/>
+        </w:rPr>
+        <w:t>id</w:t>
+      </w:r>
+      <w:r>
+        <w:rPr>
+          <w:rStyle w:val="HTMLCode"/>
+          <w:rFonts w:eastAsiaTheme="majorEastAsia"/>
+        </w:rPr>
+        <w:t>)</w:t>
+      </w:r>
+    </w:p>
+    <w:p>
+      <w:pPr>
+        <w:pStyle w:val="HTMLPreformatted"/>
+        <w:ind w:left="1440"/>
+        <w:rPr>
+          <w:rStyle w:val="HTMLCode"/>
+          <w:rFonts w:eastAsiaTheme="majorEastAsia"/>
+        </w:rPr>
+      </w:pPr>
+      <w:r>
+        <w:rPr>
+          <w:rStyle w:val="HTMLCode"/>
+          <w:rFonts w:eastAsiaTheme="majorEastAsia"/>
+        </w:rPr>
+        <w:t xml:space="preserve">    .values(revoked=</w:t>
+      </w:r>
+      <w:r>
+        <w:rPr>
+          <w:rStyle w:val="hljs-literal"/>
+        </w:rPr>
+        <w:t>True</w:t>
+      </w:r>
+      <w:r>
+        <w:rPr>
+          <w:rStyle w:val="HTMLCode"/>
+          <w:rFonts w:eastAsiaTheme="majorEastAsia"/>
+        </w:rPr>
+        <w:t>)</w:t>
+      </w:r>
+    </w:p>
+    <w:p>
+      <w:pPr>
+        <w:pStyle w:val="HTMLPreformatted"/>
+        <w:ind w:left="1440"/>
+        <w:rPr>
+          <w:rStyle w:val="HTMLCode"/>
+          <w:rFonts w:eastAsiaTheme="majorEastAsia"/>
+        </w:rPr>
+      </w:pPr>
+      <w:r>
+        <w:rPr>
+          <w:rStyle w:val="HTMLCode"/>
+          <w:rFonts w:eastAsiaTheme="majorEastAsia"/>
+        </w:rPr>
+        <w:t>)</w:t>
+      </w:r>
+    </w:p>
+    <w:p>
+      <w:pPr>
+        <w:pStyle w:val="HTMLPreformatted"/>
+        <w:ind w:left="1440"/>
+        <w:rPr>
+          <w:rStyle w:val="HTMLCode"/>
+          <w:rFonts w:eastAsiaTheme="majorEastAsia"/>
+        </w:rPr>
+      </w:pPr>
+      <w:r>
+        <w:rPr>
+          <w:rStyle w:val="hljs-keyword"/>
+        </w:rPr>
+        <w:t>await</w:t>
+      </w:r>
+      <w:r>
+        <w:rPr>
+          <w:rStyle w:val="HTMLCode"/>
+          <w:rFonts w:eastAsiaTheme="majorEastAsia"/>
+        </w:rPr>
+        <w:t xml:space="preserve"> session.commit()</w:t>
+      </w:r>
+    </w:p>
+    <w:p>
+      <w:pPr>
+        <w:pStyle w:val="NormalWeb"/>
+        <w:numPr>
+          <w:ilvl w:val="1"/>
+          <w:numId w:val="21"/>
+        </w:numPr>
+      </w:pPr>
+      <w:r>
+        <w:t>Terminates all persistent background refresh sessions across unauthorized browsers, mobile apps, and compromised devices, forcing re-authentication.</w:t>
+      </w:r>
+    </w:p>
+    <w:p>
+      <w:pPr>
+        <w:pStyle w:val="NormalWeb"/>
+        <w:numPr>
+          <w:ilvl w:val="0"/>
+          <w:numId w:val="21"/>
+        </w:numPr>
+      </w:pPr>
+      <w:r>
+        <w:rPr>
+          <w:b/>
+          <w:bCs/>
+        </w:rPr>
+        <w:t>Step 9: UI Feedback &amp; State Cleanup (Frontend):</w:t>
+      </w:r>
+    </w:p>
+    <w:p>
+      <w:pPr>
+        <w:pStyle w:val="NormalWeb"/>
+        <w:numPr>
+          <w:ilvl w:val="1"/>
+          <w:numId w:val="21"/>
+        </w:numPr>
+      </w:pPr>
+      <w:r>
+        <w:t>Displays an immediate confirmation alert (</w:t>
+      </w:r>
+      <w:r>
+        <w:rPr>
+          <w:rStyle w:val="HTMLCode"/>
+          <w:rFonts w:eastAsiaTheme="majorEastAsia"/>
+        </w:rPr>
+        <w:t>"Password changed successfully!"</w:t>
+      </w:r>
+      <w:r>
+        <w:t>).</w:t>
+      </w:r>
+    </w:p>
+    <w:p>
+      <w:pPr>
+        <w:pStyle w:val="NormalWeb"/>
+        <w:numPr>
+          <w:ilvl w:val="1"/>
+          <w:numId w:val="21"/>
+        </w:numPr>
+      </w:pPr>
+      <w:r>
+        <w:t>Clears form input values and React component memory to ensure plain-text passwords do not linger in application state or the browser DOM.</w:t>
+      </w:r>
+    </w:p>
+    <w:p>
+      <w:pPr>
+        <w:pStyle w:val="Heading3"/>
+      </w:pPr>
+      <w:r>
+        <w:t>Core Security &amp; Architectural Takeaways</w:t>
+      </w:r>
+    </w:p>
+    <w:p>
+      <w:pPr>
+        <w:pStyle w:val="NormalWeb"/>
+        <w:numPr>
+          <w:ilvl w:val="0"/>
+          <w:numId w:val="22"/>
+        </w:numPr>
+      </w:pPr>
+      <w:r>
+        <w:rPr>
+          <w:b/>
+          <w:bCs/>
+        </w:rPr>
+        <w:t>Re-Authentication Barrier:</w:t>
+      </w:r>
+      <w:r>
+        <w:t xml:space="preserve"> A valid session token is never sufficient on its own to modify account credentials; entering the current password is required to defend against physical session hijacking.</w:t>
+      </w:r>
+    </w:p>
+    <w:p>
+      <w:pPr>
+        <w:pStyle w:val="NormalWeb"/>
+        <w:numPr>
+          <w:ilvl w:val="0"/>
+          <w:numId w:val="22"/>
+        </w:numPr>
+      </w:pPr>
+      <w:r>
+        <w:rPr>
+          <w:b/>
+          <w:bCs/>
+        </w:rPr>
+        <w:lastRenderedPageBreak/>
+        <w:t>Proactive Session Termination:</w:t>
+      </w:r>
+      <w:r>
+        <w:t xml:space="preserve"> Modifying account passwords must invalidate all active refresh tokens in the database, preventing unauthorized persistent sessions from generating new access tokens.</w:t>
+      </w:r>
+    </w:p>
+    <w:p>
+      <w:pPr>
+        <w:pStyle w:val="NormalWeb"/>
+        <w:numPr>
+          <w:ilvl w:val="0"/>
+          <w:numId w:val="22"/>
+        </w:numPr>
+      </w:pPr>
+      <w:r>
+        <w:rPr>
+          <w:b/>
+          <w:bCs/>
+        </w:rPr>
+        <w:t>Prevent Credential Reuse:</w:t>
+      </w:r>
+      <w:r>
+        <w:t xml:space="preserve"> Disallowing identical old and new passwords ensures users actually cycle compromised or aged credentials.</w:t>
+      </w:r>
+    </w:p>
+    <w:p>
+      <w:pPr>
+        <w:pStyle w:val="NormalWeb"/>
+        <w:numPr>
+          <w:ilvl w:val="0"/>
+          <w:numId w:val="22"/>
+        </w:numPr>
+      </w:pPr>
+      <w:r>
+        <w:rPr>
+          <w:b/>
+          <w:bCs/>
+        </w:rPr>
+        <w:t>Component Memory Sanitization:</w:t>
+      </w:r>
+      <w:r>
+        <w:t xml:space="preserve"> Always reset password-related state variables immediately after an API call completes, protecting credentials from memory inspection or DOM scraping.</w:t>
+      </w:r>
+    </w:p>
+    <w:p>
+      <w:pPr>
+        <w:pStyle w:val="Heading3"/>
+      </w:pPr>
+      <w:r>
+        <w:t>Verification &amp; Testing Procedure</w:t>
+      </w:r>
+    </w:p>
+    <w:p>
+      <w:pPr>
+        <w:pStyle w:val="Heading4"/>
+      </w:pPr>
+      <w:r>
+        <w:t>1. Mismatched Confirmation Test (Frontend)</w:t>
+      </w:r>
+    </w:p>
+    <w:p>
+      <w:pPr>
+        <w:pStyle w:val="NormalWeb"/>
+        <w:numPr>
+          <w:ilvl w:val="0"/>
+          <w:numId w:val="23"/>
+        </w:numPr>
+      </w:pPr>
+      <w:r>
+        <w:t xml:space="preserve">Navigate to </w:t>
+      </w:r>
+      <w:r>
+        <w:rPr>
+          <w:rStyle w:val="HTMLCode"/>
+          <w:rFonts w:eastAsiaTheme="majorEastAsia"/>
+        </w:rPr>
+        <w:t>http://localhost:3000/user/change-password</w:t>
+      </w:r>
+      <w:r>
+        <w:t>.</w:t>
+      </w:r>
+    </w:p>
+    <w:p>
+      <w:pPr>
+        <w:pStyle w:val="NormalWeb"/>
+        <w:numPr>
+          <w:ilvl w:val="0"/>
+          <w:numId w:val="23"/>
+        </w:numPr>
+      </w:pPr>
+      <w:r>
+        <w:t xml:space="preserve">Enter an old password, set the new password to </w:t>
+      </w:r>
+      <w:r>
+        <w:rPr>
+          <w:rStyle w:val="HTMLCode"/>
+          <w:rFonts w:eastAsiaTheme="majorEastAsia"/>
+        </w:rPr>
+        <w:t>Secret123!</w:t>
+      </w:r>
+      <w:r>
+        <w:t xml:space="preserve">, and confirmation to </w:t>
+      </w:r>
+      <w:r>
+        <w:rPr>
+          <w:rStyle w:val="HTMLCode"/>
+          <w:rFonts w:eastAsiaTheme="majorEastAsia"/>
+        </w:rPr>
+        <w:t>Secret999!</w:t>
+      </w:r>
+      <w:r>
+        <w:t>.</w:t>
+      </w:r>
+    </w:p>
+    <w:p>
+      <w:pPr>
+        <w:pStyle w:val="NormalWeb"/>
+        <w:numPr>
+          <w:ilvl w:val="0"/>
+          <w:numId w:val="23"/>
+        </w:numPr>
+      </w:pPr>
+      <w:r>
+        <w:t xml:space="preserve">Confirm that the client-side validation blocks submission and displays </w:t>
+      </w:r>
+      <w:r>
+        <w:rPr>
+          <w:rStyle w:val="HTMLCode"/>
+          <w:rFonts w:eastAsiaTheme="majorEastAsia"/>
+        </w:rPr>
+        <w:t>"Passwords do not match"</w:t>
+      </w:r>
+      <w:r>
+        <w:t>.</w:t>
+      </w:r>
+    </w:p>
+    <w:p>
+      <w:pPr>
+        <w:pStyle w:val="Heading4"/>
+      </w:pPr>
+      <w:r>
+        <w:t>2. Incorrect Old Password Rejection (Backend Verification)</w:t>
+      </w:r>
+    </w:p>
+    <w:p>
+      <w:pPr>
+        <w:pStyle w:val="NormalWeb"/>
+        <w:numPr>
+          <w:ilvl w:val="0"/>
+          <w:numId w:val="24"/>
+        </w:numPr>
+      </w:pPr>
+      <w:r>
+        <w:t>Submit the form with an incorrect current password.</w:t>
+      </w:r>
+    </w:p>
+    <w:p>
+      <w:pPr>
+        <w:pStyle w:val="NormalWeb"/>
+        <w:numPr>
+          <w:ilvl w:val="0"/>
+          <w:numId w:val="24"/>
+        </w:numPr>
+      </w:pPr>
+      <w:r>
+        <w:t xml:space="preserve">Verify the backend responds with HTTP </w:t>
+      </w:r>
+      <w:r>
+        <w:rPr>
+          <w:rStyle w:val="HTMLCode"/>
+          <w:rFonts w:eastAsiaTheme="majorEastAsia"/>
+        </w:rPr>
+        <w:t>401 Unauthorized</w:t>
+      </w:r>
+      <w:r>
+        <w:t>:</w:t>
+      </w:r>
+    </w:p>
+    <w:p>
+      <w:pPr>
+        <w:spacing w:beforeAutospacing="1" w:afterAutospacing="1"/>
+        <w:ind w:left="720"/>
+      </w:pPr>
+      <w:r>
+        <w:rPr>
+          <w:rStyle w:val="ng-tns-c3089768999-250"/>
+        </w:rPr>
+        <w:t>JSON</w:t>
+      </w:r>
+    </w:p>
+    <w:p>
+      <w:pPr>
+        <w:pStyle w:val="HTMLPreformatted"/>
+        <w:ind w:left="720"/>
+        <w:rPr>
+          <w:rStyle w:val="HTMLCode"/>
+          <w:rFonts w:eastAsiaTheme="majorEastAsia"/>
+        </w:rPr>
+      </w:pPr>
+      <w:r>
+        <w:rPr>
+          <w:rStyle w:val="HTMLCode"/>
+          <w:rFonts w:eastAsiaTheme="majorEastAsia"/>
+        </w:rPr>
+        <w:t>{</w:t>
+      </w:r>
+    </w:p>
+    <w:p>
+      <w:pPr>
+        <w:pStyle w:val="HTMLPreformatted"/>
+        <w:ind w:left="720"/>
+        <w:rPr>
+          <w:rStyle w:val="HTMLCode"/>
+          <w:rFonts w:eastAsiaTheme="majorEastAsia"/>
+        </w:rPr>
+      </w:pPr>
+      <w:r>
+        <w:rPr>
+          <w:rStyle w:val="HTMLCode"/>
+          <w:rFonts w:eastAsiaTheme="majorEastAsia"/>
+        </w:rPr>
+        <w:t xml:space="preserve">  </w:t>
+      </w:r>
+      <w:r>
+        <w:rPr>
+          <w:rStyle w:val="hljs-attr"/>
+        </w:rPr>
+        <w:t>"detail"</w:t>
+      </w:r>
+      <w:r>
+        <w:rPr>
+          <w:rStyle w:val="HTMLCode"/>
+          <w:rFonts w:eastAsiaTheme="majorEastAsia"/>
+        </w:rPr>
+        <w:t xml:space="preserve">: </w:t>
+      </w:r>
+      <w:r>
+        <w:rPr>
+          <w:rStyle w:val="hljs-string"/>
+        </w:rPr>
+        <w:t>"Old password is incorrect"</w:t>
+      </w:r>
+    </w:p>
+    <w:p>
+      <w:pPr>
+        <w:pStyle w:val="HTMLPreformatted"/>
+        <w:ind w:left="720"/>
+        <w:rPr>
+          <w:rStyle w:val="HTMLCode"/>
+          <w:rFonts w:eastAsiaTheme="majorEastAsia"/>
+        </w:rPr>
+      </w:pPr>
+      <w:r>
+        <w:rPr>
+          <w:rStyle w:val="HTMLCode"/>
+          <w:rFonts w:eastAsiaTheme="majorEastAsia"/>
+        </w:rPr>
+        <w:t>}</w:t>
+      </w:r>
+    </w:p>
+    <w:p>
+      <w:pPr>
+        <w:pStyle w:val="Heading4"/>
+      </w:pPr>
+      <w:r>
+        <w:t>3. Duplicate Password Check</w:t>
+      </w:r>
+    </w:p>
+    <w:p>
+      <w:pPr>
+        <w:pStyle w:val="NormalWeb"/>
+        <w:numPr>
+          <w:ilvl w:val="0"/>
+          <w:numId w:val="25"/>
+        </w:numPr>
+      </w:pPr>
+      <w:r>
+        <w:t xml:space="preserve">Submit the form using identical values for both </w:t>
+      </w:r>
+      <w:r>
+        <w:rPr>
+          <w:rStyle w:val="HTMLCode"/>
+          <w:rFonts w:eastAsiaTheme="majorEastAsia"/>
+        </w:rPr>
+        <w:t>old_password</w:t>
+      </w:r>
+      <w:r>
+        <w:t xml:space="preserve"> and </w:t>
+      </w:r>
+      <w:r>
+        <w:rPr>
+          <w:rStyle w:val="HTMLCode"/>
+          <w:rFonts w:eastAsiaTheme="majorEastAsia"/>
+        </w:rPr>
+        <w:t>new_password</w:t>
+      </w:r>
+      <w:r>
+        <w:t>.</w:t>
+      </w:r>
+    </w:p>
+    <w:p>
+      <w:pPr>
+        <w:pStyle w:val="NormalWeb"/>
+        <w:numPr>
+          <w:ilvl w:val="0"/>
+          <w:numId w:val="25"/>
+        </w:numPr>
+      </w:pPr>
+      <w:r>
+        <w:t xml:space="preserve">Verify that the endpoint returns HTTP </w:t>
+      </w:r>
+      <w:r>
+        <w:rPr>
+          <w:rStyle w:val="HTMLCode"/>
+          <w:rFonts w:eastAsiaTheme="majorEastAsia"/>
+        </w:rPr>
+        <w:t>400 Bad Request</w:t>
+      </w:r>
+      <w:r>
+        <w:t>:</w:t>
+      </w:r>
+    </w:p>
+    <w:p>
+      <w:pPr>
+        <w:spacing w:beforeAutospacing="1" w:afterAutospacing="1"/>
+        <w:ind w:left="720"/>
+      </w:pPr>
+      <w:r>
+        <w:rPr>
+          <w:rStyle w:val="ng-tns-c3089768999-251"/>
+        </w:rPr>
+        <w:t>JSON</w:t>
+      </w:r>
+    </w:p>
+    <w:p>
+      <w:pPr>
+        <w:pStyle w:val="HTMLPreformatted"/>
+        <w:ind w:left="720"/>
+        <w:rPr>
+          <w:rStyle w:val="HTMLCode"/>
+          <w:rFonts w:eastAsiaTheme="majorEastAsia"/>
+        </w:rPr>
+      </w:pPr>
+      <w:r>
+        <w:rPr>
+          <w:rStyle w:val="HTMLCode"/>
+          <w:rFonts w:eastAsiaTheme="majorEastAsia"/>
+        </w:rPr>
+        <w:t>{</w:t>
+      </w:r>
+    </w:p>
+    <w:p>
+      <w:pPr>
+        <w:pStyle w:val="HTMLPreformatted"/>
+        <w:ind w:left="720"/>
+        <w:rPr>
+          <w:rStyle w:val="HTMLCode"/>
+          <w:rFonts w:eastAsiaTheme="majorEastAsia"/>
+        </w:rPr>
+      </w:pPr>
+      <w:r>
+        <w:rPr>
+          <w:rStyle w:val="HTMLCode"/>
+          <w:rFonts w:eastAsiaTheme="majorEastAsia"/>
+        </w:rPr>
+        <w:t xml:space="preserve">  </w:t>
+      </w:r>
+      <w:r>
+        <w:rPr>
+          <w:rStyle w:val="hljs-attr"/>
+        </w:rPr>
+        <w:t>"detail"</w:t>
+      </w:r>
+      <w:r>
+        <w:rPr>
+          <w:rStyle w:val="HTMLCode"/>
+          <w:rFonts w:eastAsiaTheme="majorEastAsia"/>
+        </w:rPr>
+        <w:t xml:space="preserve">: </w:t>
+      </w:r>
+      <w:r>
+        <w:rPr>
+          <w:rStyle w:val="hljs-string"/>
+        </w:rPr>
+        <w:t>"New password cannot be the same as old password"</w:t>
+      </w:r>
+    </w:p>
+    <w:p>
+      <w:pPr>
+        <w:pStyle w:val="HTMLPreformatted"/>
+        <w:ind w:left="720"/>
+        <w:rPr>
+          <w:rStyle w:val="HTMLCode"/>
+          <w:rFonts w:eastAsiaTheme="majorEastAsia"/>
+        </w:rPr>
+      </w:pPr>
+      <w:r>
+        <w:rPr>
+          <w:rStyle w:val="HTMLCode"/>
+          <w:rFonts w:eastAsiaTheme="majorEastAsia"/>
+        </w:rPr>
+        <w:t>}</w:t>
+      </w:r>
+    </w:p>
+    <w:p>
+      <w:pPr>
+        <w:pStyle w:val="Heading4"/>
+      </w:pPr>
+      <w:r>
+        <w:t>4. Successful Password Rotation &amp; Invalidation Audit</w:t>
+      </w:r>
+    </w:p>
+    <w:p>
+      <w:pPr>
+        <w:pStyle w:val="NormalWeb"/>
+        <w:numPr>
+          <w:ilvl w:val="0"/>
+          <w:numId w:val="26"/>
+        </w:numPr>
+      </w:pPr>
+      <w:r>
+        <w:t>Submit valid credentials with a distinct new password.</w:t>
+      </w:r>
+    </w:p>
+    <w:p>
+      <w:pPr>
+        <w:pStyle w:val="NormalWeb"/>
+        <w:numPr>
+          <w:ilvl w:val="0"/>
+          <w:numId w:val="26"/>
+        </w:numPr>
+      </w:pPr>
+      <w:r>
+        <w:t xml:space="preserve">Verify the frontend displays </w:t>
+      </w:r>
+      <w:r>
+        <w:rPr>
+          <w:rStyle w:val="HTMLCode"/>
+          <w:rFonts w:eastAsiaTheme="majorEastAsia"/>
+        </w:rPr>
+        <w:t>"Password changed successfully!"</w:t>
+      </w:r>
+      <w:r>
+        <w:t xml:space="preserve"> and clears all input fields.</w:t>
+      </w:r>
+    </w:p>
+    <w:p>
+      <w:pPr>
+        <w:pStyle w:val="NormalWeb"/>
+        <w:numPr>
+          <w:ilvl w:val="0"/>
+          <w:numId w:val="26"/>
+        </w:numPr>
+      </w:pPr>
+      <w:r>
+        <w:t>Open phpMyAdmin (</w:t>
+      </w:r>
+      <w:r>
+        <w:rPr>
+          <w:rStyle w:val="HTMLCode"/>
+          <w:rFonts w:eastAsiaTheme="majorEastAsia"/>
+        </w:rPr>
+        <w:t>http://localhost/phpmyadmin</w:t>
+      </w:r>
+      <w:r>
+        <w:t xml:space="preserve">) and check the </w:t>
+      </w:r>
+      <w:r>
+        <w:rPr>
+          <w:rStyle w:val="HTMLCode"/>
+          <w:rFonts w:eastAsiaTheme="majorEastAsia"/>
+        </w:rPr>
+        <w:t>refresh_tokens</w:t>
+      </w:r>
+      <w:r>
+        <w:t xml:space="preserve"> table:</w:t>
+      </w:r>
+    </w:p>
+    <w:p>
+      <w:pPr>
+        <w:pStyle w:val="NormalWeb"/>
+        <w:numPr>
+          <w:ilvl w:val="1"/>
+          <w:numId w:val="26"/>
+        </w:numPr>
+      </w:pPr>
+      <w:r>
+        <w:lastRenderedPageBreak/>
+        <w:t xml:space="preserve">Confirm all entries belonging to the user's </w:t>
+      </w:r>
+      <w:r>
+        <w:rPr>
+          <w:rStyle w:val="HTMLCode"/>
+          <w:rFonts w:eastAsiaTheme="majorEastAsia"/>
+        </w:rPr>
+        <w:t>user_id</w:t>
+      </w:r>
+      <w:r>
+        <w:t xml:space="preserve"> now reflect </w:t>
+      </w:r>
+      <w:r>
+        <w:rPr>
+          <w:rStyle w:val="HTMLCode"/>
+          <w:rFonts w:eastAsiaTheme="majorEastAsia"/>
+        </w:rPr>
+        <w:t>revoked = 1</w:t>
+      </w:r>
+      <w:r>
+        <w:t>.</w:t>
+      </w:r>
+    </w:p>
+    <w:p>
+      <w:pPr>
+        <w:pStyle w:val="NormalWeb"/>
+        <w:numPr>
+          <w:ilvl w:val="0"/>
+          <w:numId w:val="26"/>
+        </w:numPr>
+      </w:pPr>
+      <w:r>
+        <w:t xml:space="preserve">Log in via </w:t>
+      </w:r>
+      <w:r>
+        <w:rPr>
+          <w:rStyle w:val="HTMLCode"/>
+          <w:rFonts w:eastAsiaTheme="majorEastAsia"/>
+        </w:rPr>
+        <w:t>POST /api/account/login</w:t>
+      </w:r>
+      <w:r>
+        <w:t xml:space="preserve"> using the old password and confirm rejection; verify that the new password logs in successfully.</w:t>
+      </w:r>
+    </w:p>
+    <w:p/>
+    <w:bookmarkEnd w:id="0"/>
+    <w:p/>
     <w:sectPr>
       <w:pgSz w:w="12240" w:h="15840"/>
       <w:pgMar w:top="1440" w:right="1440" w:bottom="1440" w:left="1440" w:header="720" w:footer="720" w:gutter="0"/>
@@ -2540,6 +4133,304 @@
     </w:lvl>
   </w:abstractNum>
   <w:abstractNum w:abstractNumId="1" w15:restartNumberingAfterBreak="0">
+    <w:nsid w:val="02691F3D"/>
+    <w:multiLevelType w:val="multilevel"/>
+    <w:tmpl w:val="361AE320"/>
+    <w:lvl w:ilvl="0">
+      <w:start w:val="1"/>
+      <w:numFmt w:val="bullet"/>
+      <w:lvlText w:val=""/>
+      <w:lvlJc w:val="left"/>
+      <w:pPr>
+        <w:tabs>
+          <w:tab w:val="num" w:pos="720"/>
+        </w:tabs>
+        <w:ind w:left="720" w:hanging="360"/>
+      </w:pPr>
+      <w:rPr>
+        <w:rFonts w:ascii="Symbol" w:hAnsi="Symbol" w:hint="default"/>
+        <w:sz w:val="20"/>
+      </w:rPr>
+    </w:lvl>
+    <w:lvl w:ilvl="1" w:tentative="1">
+      <w:start w:val="1"/>
+      <w:numFmt w:val="bullet"/>
+      <w:lvlText w:val="o"/>
+      <w:lvlJc w:val="left"/>
+      <w:pPr>
+        <w:tabs>
+          <w:tab w:val="num" w:pos="1440"/>
+        </w:tabs>
+        <w:ind w:left="1440" w:hanging="360"/>
+      </w:pPr>
+      <w:rPr>
+        <w:rFonts w:ascii="Courier New" w:hAnsi="Courier New" w:hint="default"/>
+        <w:sz w:val="20"/>
+      </w:rPr>
+    </w:lvl>
+    <w:lvl w:ilvl="2" w:tentative="1">
+      <w:start w:val="1"/>
+      <w:numFmt w:val="bullet"/>
+      <w:lvlText w:val=""/>
+      <w:lvlJc w:val="left"/>
+      <w:pPr>
+        <w:tabs>
+          <w:tab w:val="num" w:pos="2160"/>
+        </w:tabs>
+        <w:ind w:left="2160" w:hanging="360"/>
+      </w:pPr>
+      <w:rPr>
+        <w:rFonts w:ascii="Wingdings" w:hAnsi="Wingdings" w:hint="default"/>
+        <w:sz w:val="20"/>
+      </w:rPr>
+    </w:lvl>
+    <w:lvl w:ilvl="3" w:tentative="1">
+      <w:start w:val="1"/>
+      <w:numFmt w:val="bullet"/>
+      <w:lvlText w:val=""/>
+      <w:lvlJc w:val="left"/>
+      <w:pPr>
+        <w:tabs>
+          <w:tab w:val="num" w:pos="2880"/>
+        </w:tabs>
+        <w:ind w:left="2880" w:hanging="360"/>
+      </w:pPr>
+      <w:rPr>
+        <w:rFonts w:ascii="Wingdings" w:hAnsi="Wingdings" w:hint="default"/>
+        <w:sz w:val="20"/>
+      </w:rPr>
+    </w:lvl>
+    <w:lvl w:ilvl="4" w:tentative="1">
+      <w:start w:val="1"/>
+      <w:numFmt w:val="bullet"/>
+      <w:lvlText w:val=""/>
+      <w:lvlJc w:val="left"/>
+      <w:pPr>
+        <w:tabs>
+          <w:tab w:val="num" w:pos="3600"/>
+        </w:tabs>
+        <w:ind w:left="3600" w:hanging="360"/>
+      </w:pPr>
+      <w:rPr>
+        <w:rFonts w:ascii="Wingdings" w:hAnsi="Wingdings" w:hint="default"/>
+        <w:sz w:val="20"/>
+      </w:rPr>
+    </w:lvl>
+    <w:lvl w:ilvl="5" w:tentative="1">
+      <w:start w:val="1"/>
+      <w:numFmt w:val="bullet"/>
+      <w:lvlText w:val=""/>
+      <w:lvlJc w:val="left"/>
+      <w:pPr>
+        <w:tabs>
+          <w:tab w:val="num" w:pos="4320"/>
+        </w:tabs>
+        <w:ind w:left="4320" w:hanging="360"/>
+      </w:pPr>
+      <w:rPr>
+        <w:rFonts w:ascii="Wingdings" w:hAnsi="Wingdings" w:hint="default"/>
+        <w:sz w:val="20"/>
+      </w:rPr>
+    </w:lvl>
+    <w:lvl w:ilvl="6" w:tentative="1">
+      <w:start w:val="1"/>
+      <w:numFmt w:val="bullet"/>
+      <w:lvlText w:val=""/>
+      <w:lvlJc w:val="left"/>
+      <w:pPr>
+        <w:tabs>
+          <w:tab w:val="num" w:pos="5040"/>
+        </w:tabs>
+        <w:ind w:left="5040" w:hanging="360"/>
+      </w:pPr>
+      <w:rPr>
+        <w:rFonts w:ascii="Wingdings" w:hAnsi="Wingdings" w:hint="default"/>
+        <w:sz w:val="20"/>
+      </w:rPr>
+    </w:lvl>
+    <w:lvl w:ilvl="7" w:tentative="1">
+      <w:start w:val="1"/>
+      <w:numFmt w:val="bullet"/>
+      <w:lvlText w:val=""/>
+      <w:lvlJc w:val="left"/>
+      <w:pPr>
+        <w:tabs>
+          <w:tab w:val="num" w:pos="5760"/>
+        </w:tabs>
+        <w:ind w:left="5760" w:hanging="360"/>
+      </w:pPr>
+      <w:rPr>
+        <w:rFonts w:ascii="Wingdings" w:hAnsi="Wingdings" w:hint="default"/>
+        <w:sz w:val="20"/>
+      </w:rPr>
+    </w:lvl>
+    <w:lvl w:ilvl="8" w:tentative="1">
+      <w:start w:val="1"/>
+      <w:numFmt w:val="bullet"/>
+      <w:lvlText w:val=""/>
+      <w:lvlJc w:val="left"/>
+      <w:pPr>
+        <w:tabs>
+          <w:tab w:val="num" w:pos="6480"/>
+        </w:tabs>
+        <w:ind w:left="6480" w:hanging="360"/>
+      </w:pPr>
+      <w:rPr>
+        <w:rFonts w:ascii="Wingdings" w:hAnsi="Wingdings" w:hint="default"/>
+        <w:sz w:val="20"/>
+      </w:rPr>
+    </w:lvl>
+  </w:abstractNum>
+  <w:abstractNum w:abstractNumId="2" w15:restartNumberingAfterBreak="0">
+    <w:nsid w:val="0B8C2A2D"/>
+    <w:multiLevelType w:val="multilevel"/>
+    <w:tmpl w:val="6C3E2394"/>
+    <w:lvl w:ilvl="0">
+      <w:start w:val="1"/>
+      <w:numFmt w:val="bullet"/>
+      <w:lvlText w:val=""/>
+      <w:lvlJc w:val="left"/>
+      <w:pPr>
+        <w:tabs>
+          <w:tab w:val="num" w:pos="720"/>
+        </w:tabs>
+        <w:ind w:left="720" w:hanging="360"/>
+      </w:pPr>
+      <w:rPr>
+        <w:rFonts w:ascii="Symbol" w:hAnsi="Symbol" w:hint="default"/>
+        <w:sz w:val="20"/>
+      </w:rPr>
+    </w:lvl>
+    <w:lvl w:ilvl="1" w:tentative="1">
+      <w:start w:val="1"/>
+      <w:numFmt w:val="bullet"/>
+      <w:lvlText w:val="o"/>
+      <w:lvlJc w:val="left"/>
+      <w:pPr>
+        <w:tabs>
+          <w:tab w:val="num" w:pos="1440"/>
+        </w:tabs>
+        <w:ind w:left="1440" w:hanging="360"/>
+      </w:pPr>
+      <w:rPr>
+        <w:rFonts w:ascii="Courier New" w:hAnsi="Courier New" w:hint="default"/>
+        <w:sz w:val="20"/>
+      </w:rPr>
+    </w:lvl>
+    <w:lvl w:ilvl="2" w:tentative="1">
+      <w:start w:val="1"/>
+      <w:numFmt w:val="bullet"/>
+      <w:lvlText w:val=""/>
+      <w:lvlJc w:val="left"/>
+      <w:pPr>
+        <w:tabs>
+          <w:tab w:val="num" w:pos="2160"/>
+        </w:tabs>
+        <w:ind w:left="2160" w:hanging="360"/>
+      </w:pPr>
+      <w:rPr>
+        <w:rFonts w:ascii="Wingdings" w:hAnsi="Wingdings" w:hint="default"/>
+        <w:sz w:val="20"/>
+      </w:rPr>
+    </w:lvl>
+    <w:lvl w:ilvl="3" w:tentative="1">
+      <w:start w:val="1"/>
+      <w:numFmt w:val="bullet"/>
+      <w:lvlText w:val=""/>
+      <w:lvlJc w:val="left"/>
+      <w:pPr>
+        <w:tabs>
+          <w:tab w:val="num" w:pos="2880"/>
+        </w:tabs>
+        <w:ind w:left="2880" w:hanging="360"/>
+      </w:pPr>
+      <w:rPr>
+        <w:rFonts w:ascii="Wingdings" w:hAnsi="Wingdings" w:hint="default"/>
+        <w:sz w:val="20"/>
+      </w:rPr>
+    </w:lvl>
+    <w:lvl w:ilvl="4" w:tentative="1">
+      <w:start w:val="1"/>
+      <w:numFmt w:val="bullet"/>
+      <w:lvlText w:val=""/>
+      <w:lvlJc w:val="left"/>
+      <w:pPr>
+        <w:tabs>
+          <w:tab w:val="num" w:pos="3600"/>
+        </w:tabs>
+        <w:ind w:left="3600" w:hanging="360"/>
+      </w:pPr>
+      <w:rPr>
+        <w:rFonts w:ascii="Wingdings" w:hAnsi="Wingdings" w:hint="default"/>
+        <w:sz w:val="20"/>
+      </w:rPr>
+    </w:lvl>
+    <w:lvl w:ilvl="5" w:tentative="1">
+      <w:start w:val="1"/>
+      <w:numFmt w:val="bullet"/>
+      <w:lvlText w:val=""/>
+      <w:lvlJc w:val="left"/>
+      <w:pPr>
+        <w:tabs>
+          <w:tab w:val="num" w:pos="4320"/>
+        </w:tabs>
+        <w:ind w:left="4320" w:hanging="360"/>
+      </w:pPr>
+      <w:rPr>
+        <w:rFonts w:ascii="Wingdings" w:hAnsi="Wingdings" w:hint="default"/>
+        <w:sz w:val="20"/>
+      </w:rPr>
+    </w:lvl>
+    <w:lvl w:ilvl="6" w:tentative="1">
+      <w:start w:val="1"/>
+      <w:numFmt w:val="bullet"/>
+      <w:lvlText w:val=""/>
+      <w:lvlJc w:val="left"/>
+      <w:pPr>
+        <w:tabs>
+          <w:tab w:val="num" w:pos="5040"/>
+        </w:tabs>
+        <w:ind w:left="5040" w:hanging="360"/>
+      </w:pPr>
+      <w:rPr>
+        <w:rFonts w:ascii="Wingdings" w:hAnsi="Wingdings" w:hint="default"/>
+        <w:sz w:val="20"/>
+      </w:rPr>
+    </w:lvl>
+    <w:lvl w:ilvl="7" w:tentative="1">
+      <w:start w:val="1"/>
+      <w:numFmt w:val="bullet"/>
+      <w:lvlText w:val=""/>
+      <w:lvlJc w:val="left"/>
+      <w:pPr>
+        <w:tabs>
+          <w:tab w:val="num" w:pos="5760"/>
+        </w:tabs>
+        <w:ind w:left="5760" w:hanging="360"/>
+      </w:pPr>
+      <w:rPr>
+        <w:rFonts w:ascii="Wingdings" w:hAnsi="Wingdings" w:hint="default"/>
+        <w:sz w:val="20"/>
+      </w:rPr>
+    </w:lvl>
+    <w:lvl w:ilvl="8" w:tentative="1">
+      <w:start w:val="1"/>
+      <w:numFmt w:val="bullet"/>
+      <w:lvlText w:val=""/>
+      <w:lvlJc w:val="left"/>
+      <w:pPr>
+        <w:tabs>
+          <w:tab w:val="num" w:pos="6480"/>
+        </w:tabs>
+        <w:ind w:left="6480" w:hanging="360"/>
+      </w:pPr>
+      <w:rPr>
+        <w:rFonts w:ascii="Wingdings" w:hAnsi="Wingdings" w:hint="default"/>
+        <w:sz w:val="20"/>
+      </w:rPr>
+    </w:lvl>
+  </w:abstractNum>
+  <w:abstractNum w:abstractNumId="3" w15:restartNumberingAfterBreak="0">
     <w:nsid w:val="0DDB30C3"/>
     <w:multiLevelType w:val="multilevel"/>
     <w:tmpl w:val="D44624E2"/>
@@ -2688,7 +4579,7 @@
       </w:rPr>
     </w:lvl>
   </w:abstractNum>
-  <w:abstractNum w:abstractNumId="2" w15:restartNumberingAfterBreak="0">
+  <w:abstractNum w:abstractNumId="4" w15:restartNumberingAfterBreak="0">
     <w:nsid w:val="1C8543D8"/>
     <w:multiLevelType w:val="multilevel"/>
     <w:tmpl w:val="EEFE34DC"/>
@@ -2833,7 +4724,7 @@
       </w:rPr>
     </w:lvl>
   </w:abstractNum>
-  <w:abstractNum w:abstractNumId="3" w15:restartNumberingAfterBreak="0">
+  <w:abstractNum w:abstractNumId="5" w15:restartNumberingAfterBreak="0">
     <w:nsid w:val="250737B8"/>
     <w:multiLevelType w:val="multilevel"/>
     <w:tmpl w:val="93106F5E"/>
@@ -2982,7 +4873,7 @@
       </w:rPr>
     </w:lvl>
   </w:abstractNum>
-  <w:abstractNum w:abstractNumId="4" w15:restartNumberingAfterBreak="0">
+  <w:abstractNum w:abstractNumId="6" w15:restartNumberingAfterBreak="0">
     <w:nsid w:val="26E029CF"/>
     <w:multiLevelType w:val="multilevel"/>
     <w:tmpl w:val="3CA631EC"/>
@@ -3131,7 +5022,7 @@
       </w:rPr>
     </w:lvl>
   </w:abstractNum>
-  <w:abstractNum w:abstractNumId="5" w15:restartNumberingAfterBreak="0">
+  <w:abstractNum w:abstractNumId="7" w15:restartNumberingAfterBreak="0">
     <w:nsid w:val="280B6D4D"/>
     <w:multiLevelType w:val="multilevel"/>
     <w:tmpl w:val="C550110C"/>
@@ -3280,7 +5171,7 @@
       </w:rPr>
     </w:lvl>
   </w:abstractNum>
-  <w:abstractNum w:abstractNumId="6" w15:restartNumberingAfterBreak="0">
+  <w:abstractNum w:abstractNumId="8" w15:restartNumberingAfterBreak="0">
     <w:nsid w:val="2B3E2D66"/>
     <w:multiLevelType w:val="multilevel"/>
     <w:tmpl w:val="DD685856"/>
@@ -3429,7 +5320,7 @@
       </w:rPr>
     </w:lvl>
   </w:abstractNum>
-  <w:abstractNum w:abstractNumId="7" w15:restartNumberingAfterBreak="0">
+  <w:abstractNum w:abstractNumId="9" w15:restartNumberingAfterBreak="0">
     <w:nsid w:val="33167FC6"/>
     <w:multiLevelType w:val="multilevel"/>
     <w:tmpl w:val="61847F00"/>
@@ -3546,7 +5437,7 @@
       </w:pPr>
     </w:lvl>
   </w:abstractNum>
-  <w:abstractNum w:abstractNumId="8" w15:restartNumberingAfterBreak="0">
+  <w:abstractNum w:abstractNumId="10" w15:restartNumberingAfterBreak="0">
     <w:nsid w:val="39A651A3"/>
     <w:multiLevelType w:val="multilevel"/>
     <w:tmpl w:val="5C9404F8"/>
@@ -3695,7 +5586,156 @@
       </w:rPr>
     </w:lvl>
   </w:abstractNum>
-  <w:abstractNum w:abstractNumId="9" w15:restartNumberingAfterBreak="0">
+  <w:abstractNum w:abstractNumId="11" w15:restartNumberingAfterBreak="0">
+    <w:nsid w:val="3E1565B2"/>
+    <w:multiLevelType w:val="multilevel"/>
+    <w:tmpl w:val="63E83542"/>
+    <w:lvl w:ilvl="0">
+      <w:start w:val="1"/>
+      <w:numFmt w:val="bullet"/>
+      <w:lvlText w:val=""/>
+      <w:lvlJc w:val="left"/>
+      <w:pPr>
+        <w:tabs>
+          <w:tab w:val="num" w:pos="720"/>
+        </w:tabs>
+        <w:ind w:left="720" w:hanging="360"/>
+      </w:pPr>
+      <w:rPr>
+        <w:rFonts w:ascii="Symbol" w:hAnsi="Symbol" w:hint="default"/>
+        <w:sz w:val="20"/>
+      </w:rPr>
+    </w:lvl>
+    <w:lvl w:ilvl="1" w:tentative="1">
+      <w:start w:val="1"/>
+      <w:numFmt w:val="bullet"/>
+      <w:lvlText w:val="o"/>
+      <w:lvlJc w:val="left"/>
+      <w:pPr>
+        <w:tabs>
+          <w:tab w:val="num" w:pos="1440"/>
+        </w:tabs>
+        <w:ind w:left="1440" w:hanging="360"/>
+      </w:pPr>
+      <w:rPr>
+        <w:rFonts w:ascii="Courier New" w:hAnsi="Courier New" w:hint="default"/>
+        <w:sz w:val="20"/>
+      </w:rPr>
+    </w:lvl>
+    <w:lvl w:ilvl="2" w:tentative="1">
+      <w:start w:val="1"/>
+      <w:numFmt w:val="bullet"/>
+      <w:lvlText w:val=""/>
+      <w:lvlJc w:val="left"/>
+      <w:pPr>
+        <w:tabs>
+          <w:tab w:val="num" w:pos="2160"/>
+        </w:tabs>
+        <w:ind w:left="2160" w:hanging="360"/>
+      </w:pPr>
+      <w:rPr>
+        <w:rFonts w:ascii="Wingdings" w:hAnsi="Wingdings" w:hint="default"/>
+        <w:sz w:val="20"/>
+      </w:rPr>
+    </w:lvl>
+    <w:lvl w:ilvl="3" w:tentative="1">
+      <w:start w:val="1"/>
+      <w:numFmt w:val="bullet"/>
+      <w:lvlText w:val=""/>
+      <w:lvlJc w:val="left"/>
+      <w:pPr>
+        <w:tabs>
+          <w:tab w:val="num" w:pos="2880"/>
+        </w:tabs>
+        <w:ind w:left="2880" w:hanging="360"/>
+      </w:pPr>
+      <w:rPr>
+        <w:rFonts w:ascii="Wingdings" w:hAnsi="Wingdings" w:hint="default"/>
+        <w:sz w:val="20"/>
+      </w:rPr>
+    </w:lvl>
+    <w:lvl w:ilvl="4" w:tentative="1">
+      <w:start w:val="1"/>
+      <w:numFmt w:val="bullet"/>
+      <w:lvlText w:val=""/>
+      <w:lvlJc w:val="left"/>
+      <w:pPr>
+        <w:tabs>
+          <w:tab w:val="num" w:pos="3600"/>
+        </w:tabs>
+        <w:ind w:left="3600" w:hanging="360"/>
+      </w:pPr>
+      <w:rPr>
+        <w:rFonts w:ascii="Wingdings" w:hAnsi="Wingdings" w:hint="default"/>
+        <w:sz w:val="20"/>
+      </w:rPr>
+    </w:lvl>
+    <w:lvl w:ilvl="5" w:tentative="1">
+      <w:start w:val="1"/>
+      <w:numFmt w:val="bullet"/>
+      <w:lvlText w:val=""/>
+      <w:lvlJc w:val="left"/>
+      <w:pPr>
+        <w:tabs>
+          <w:tab w:val="num" w:pos="4320"/>
+        </w:tabs>
+        <w:ind w:left="4320" w:hanging="360"/>
+      </w:pPr>
+      <w:rPr>
+        <w:rFonts w:ascii="Wingdings" w:hAnsi="Wingdings" w:hint="default"/>
+        <w:sz w:val="20"/>
+      </w:rPr>
+    </w:lvl>
+    <w:lvl w:ilvl="6" w:tentative="1">
+      <w:start w:val="1"/>
+      <w:numFmt w:val="bullet"/>
+      <w:lvlText w:val=""/>
+      <w:lvlJc w:val="left"/>
+      <w:pPr>
+        <w:tabs>
+          <w:tab w:val="num" w:pos="5040"/>
+        </w:tabs>
+        <w:ind w:left="5040" w:hanging="360"/>
+      </w:pPr>
+      <w:rPr>
+        <w:rFonts w:ascii="Wingdings" w:hAnsi="Wingdings" w:hint="default"/>
+        <w:sz w:val="20"/>
+      </w:rPr>
+    </w:lvl>
+    <w:lvl w:ilvl="7" w:tentative="1">
+      <w:start w:val="1"/>
+      <w:numFmt w:val="bullet"/>
+      <w:lvlText w:val=""/>
+      <w:lvlJc w:val="left"/>
+      <w:pPr>
+        <w:tabs>
+          <w:tab w:val="num" w:pos="5760"/>
+        </w:tabs>
+        <w:ind w:left="5760" w:hanging="360"/>
+      </w:pPr>
+      <w:rPr>
+        <w:rFonts w:ascii="Wingdings" w:hAnsi="Wingdings" w:hint="default"/>
+        <w:sz w:val="20"/>
+      </w:rPr>
+    </w:lvl>
+    <w:lvl w:ilvl="8" w:tentative="1">
+      <w:start w:val="1"/>
+      <w:numFmt w:val="bullet"/>
+      <w:lvlText w:val=""/>
+      <w:lvlJc w:val="left"/>
+      <w:pPr>
+        <w:tabs>
+          <w:tab w:val="num" w:pos="6480"/>
+        </w:tabs>
+        <w:ind w:left="6480" w:hanging="360"/>
+      </w:pPr>
+      <w:rPr>
+        <w:rFonts w:ascii="Wingdings" w:hAnsi="Wingdings" w:hint="default"/>
+        <w:sz w:val="20"/>
+      </w:rPr>
+    </w:lvl>
+  </w:abstractNum>
+  <w:abstractNum w:abstractNumId="12" w15:restartNumberingAfterBreak="0">
     <w:nsid w:val="3EBC018E"/>
     <w:multiLevelType w:val="multilevel"/>
     <w:tmpl w:val="B25AD2A8"/>
@@ -3844,7 +5884,7 @@
       </w:rPr>
     </w:lvl>
   </w:abstractNum>
-  <w:abstractNum w:abstractNumId="10" w15:restartNumberingAfterBreak="0">
+  <w:abstractNum w:abstractNumId="13" w15:restartNumberingAfterBreak="0">
     <w:nsid w:val="43514619"/>
     <w:multiLevelType w:val="multilevel"/>
     <w:tmpl w:val="C26E7A5C"/>
@@ -3961,7 +6001,7 @@
       </w:pPr>
     </w:lvl>
   </w:abstractNum>
-  <w:abstractNum w:abstractNumId="11" w15:restartNumberingAfterBreak="0">
+  <w:abstractNum w:abstractNumId="14" w15:restartNumberingAfterBreak="0">
     <w:nsid w:val="49BD15EF"/>
     <w:multiLevelType w:val="multilevel"/>
     <w:tmpl w:val="5CFCBFD4"/>
@@ -4078,7 +6118,7 @@
       </w:pPr>
     </w:lvl>
   </w:abstractNum>
-  <w:abstractNum w:abstractNumId="12" w15:restartNumberingAfterBreak="0">
+  <w:abstractNum w:abstractNumId="15" w15:restartNumberingAfterBreak="0">
     <w:nsid w:val="49C54A29"/>
     <w:multiLevelType w:val="multilevel"/>
     <w:tmpl w:val="784EDE24"/>
@@ -4195,7 +6235,124 @@
       </w:pPr>
     </w:lvl>
   </w:abstractNum>
-  <w:abstractNum w:abstractNumId="13" w15:restartNumberingAfterBreak="0">
+  <w:abstractNum w:abstractNumId="16" w15:restartNumberingAfterBreak="0">
+    <w:nsid w:val="4C650DE2"/>
+    <w:multiLevelType w:val="multilevel"/>
+    <w:tmpl w:val="8D0A3A60"/>
+    <w:lvl w:ilvl="0">
+      <w:start w:val="1"/>
+      <w:numFmt w:val="decimal"/>
+      <w:lvlText w:val="%1."/>
+      <w:lvlJc w:val="left"/>
+      <w:pPr>
+        <w:tabs>
+          <w:tab w:val="num" w:pos="720"/>
+        </w:tabs>
+        <w:ind w:left="720" w:hanging="360"/>
+      </w:pPr>
+    </w:lvl>
+    <w:lvl w:ilvl="1">
+      <w:start w:val="1"/>
+      <w:numFmt w:val="bullet"/>
+      <w:lvlText w:val="o"/>
+      <w:lvlJc w:val="left"/>
+      <w:pPr>
+        <w:tabs>
+          <w:tab w:val="num" w:pos="1440"/>
+        </w:tabs>
+        <w:ind w:left="1440" w:hanging="360"/>
+      </w:pPr>
+      <w:rPr>
+        <w:rFonts w:ascii="Courier New" w:hAnsi="Courier New" w:hint="default"/>
+        <w:sz w:val="20"/>
+      </w:rPr>
+    </w:lvl>
+    <w:lvl w:ilvl="2" w:tentative="1">
+      <w:start w:val="1"/>
+      <w:numFmt w:val="decimal"/>
+      <w:lvlText w:val="%3."/>
+      <w:lvlJc w:val="left"/>
+      <w:pPr>
+        <w:tabs>
+          <w:tab w:val="num" w:pos="2160"/>
+        </w:tabs>
+        <w:ind w:left="2160" w:hanging="360"/>
+      </w:pPr>
+    </w:lvl>
+    <w:lvl w:ilvl="3" w:tentative="1">
+      <w:start w:val="1"/>
+      <w:numFmt w:val="decimal"/>
+      <w:lvlText w:val="%4."/>
+      <w:lvlJc w:val="left"/>
+      <w:pPr>
+        <w:tabs>
+          <w:tab w:val="num" w:pos="2880"/>
+        </w:tabs>
+        <w:ind w:left="2880" w:hanging="360"/>
+      </w:pPr>
+    </w:lvl>
+    <w:lvl w:ilvl="4" w:tentative="1">
+      <w:start w:val="1"/>
+      <w:numFmt w:val="decimal"/>
+      <w:lvlText w:val="%5."/>
+      <w:lvlJc w:val="left"/>
+      <w:pPr>
+        <w:tabs>
+          <w:tab w:val="num" w:pos="3600"/>
+        </w:tabs>
+        <w:ind w:left="3600" w:hanging="360"/>
+      </w:pPr>
+    </w:lvl>
+    <w:lvl w:ilvl="5" w:tentative="1">
+      <w:start w:val="1"/>
+      <w:numFmt w:val="decimal"/>
+      <w:lvlText w:val="%6."/>
+      <w:lvlJc w:val="left"/>
+      <w:pPr>
+        <w:tabs>
+          <w:tab w:val="num" w:pos="4320"/>
+        </w:tabs>
+        <w:ind w:left="4320" w:hanging="360"/>
+      </w:pPr>
+    </w:lvl>
+    <w:lvl w:ilvl="6" w:tentative="1">
+      <w:start w:val="1"/>
+      <w:numFmt w:val="decimal"/>
+      <w:lvlText w:val="%7."/>
+      <w:lvlJc w:val="left"/>
+      <w:pPr>
+        <w:tabs>
+          <w:tab w:val="num" w:pos="5040"/>
+        </w:tabs>
+        <w:ind w:left="5040" w:hanging="360"/>
+      </w:pPr>
+    </w:lvl>
+    <w:lvl w:ilvl="7" w:tentative="1">
+      <w:start w:val="1"/>
+      <w:numFmt w:val="decimal"/>
+      <w:lvlText w:val="%8."/>
+      <w:lvlJc w:val="left"/>
+      <w:pPr>
+        <w:tabs>
+          <w:tab w:val="num" w:pos="5760"/>
+        </w:tabs>
+        <w:ind w:left="5760" w:hanging="360"/>
+      </w:pPr>
+    </w:lvl>
+    <w:lvl w:ilvl="8" w:tentative="1">
+      <w:start w:val="1"/>
+      <w:numFmt w:val="decimal"/>
+      <w:lvlText w:val="%9."/>
+      <w:lvlJc w:val="left"/>
+      <w:pPr>
+        <w:tabs>
+          <w:tab w:val="num" w:pos="6480"/>
+        </w:tabs>
+        <w:ind w:left="6480" w:hanging="360"/>
+      </w:pPr>
+    </w:lvl>
+  </w:abstractNum>
+  <w:abstractNum w:abstractNumId="17" w15:restartNumberingAfterBreak="0">
     <w:nsid w:val="4D213981"/>
     <w:multiLevelType w:val="multilevel"/>
     <w:tmpl w:val="8CAE54EC"/>
@@ -4344,7 +6501,156 @@
       </w:rPr>
     </w:lvl>
   </w:abstractNum>
-  <w:abstractNum w:abstractNumId="14" w15:restartNumberingAfterBreak="0">
+  <w:abstractNum w:abstractNumId="18" w15:restartNumberingAfterBreak="0">
+    <w:nsid w:val="520978C1"/>
+    <w:multiLevelType w:val="multilevel"/>
+    <w:tmpl w:val="BBB821AC"/>
+    <w:lvl w:ilvl="0">
+      <w:start w:val="1"/>
+      <w:numFmt w:val="bullet"/>
+      <w:lvlText w:val=""/>
+      <w:lvlJc w:val="left"/>
+      <w:pPr>
+        <w:tabs>
+          <w:tab w:val="num" w:pos="720"/>
+        </w:tabs>
+        <w:ind w:left="720" w:hanging="360"/>
+      </w:pPr>
+      <w:rPr>
+        <w:rFonts w:ascii="Symbol" w:hAnsi="Symbol" w:hint="default"/>
+        <w:sz w:val="20"/>
+      </w:rPr>
+    </w:lvl>
+    <w:lvl w:ilvl="1" w:tentative="1">
+      <w:start w:val="1"/>
+      <w:numFmt w:val="bullet"/>
+      <w:lvlText w:val="o"/>
+      <w:lvlJc w:val="left"/>
+      <w:pPr>
+        <w:tabs>
+          <w:tab w:val="num" w:pos="1440"/>
+        </w:tabs>
+        <w:ind w:left="1440" w:hanging="360"/>
+      </w:pPr>
+      <w:rPr>
+        <w:rFonts w:ascii="Courier New" w:hAnsi="Courier New" w:hint="default"/>
+        <w:sz w:val="20"/>
+      </w:rPr>
+    </w:lvl>
+    <w:lvl w:ilvl="2" w:tentative="1">
+      <w:start w:val="1"/>
+      <w:numFmt w:val="bullet"/>
+      <w:lvlText w:val=""/>
+      <w:lvlJc w:val="left"/>
+      <w:pPr>
+        <w:tabs>
+          <w:tab w:val="num" w:pos="2160"/>
+        </w:tabs>
+        <w:ind w:left="2160" w:hanging="360"/>
+      </w:pPr>
+      <w:rPr>
+        <w:rFonts w:ascii="Wingdings" w:hAnsi="Wingdings" w:hint="default"/>
+        <w:sz w:val="20"/>
+      </w:rPr>
+    </w:lvl>
+    <w:lvl w:ilvl="3" w:tentative="1">
+      <w:start w:val="1"/>
+      <w:numFmt w:val="bullet"/>
+      <w:lvlText w:val=""/>
+      <w:lvlJc w:val="left"/>
+      <w:pPr>
+        <w:tabs>
+          <w:tab w:val="num" w:pos="2880"/>
+        </w:tabs>
+        <w:ind w:left="2880" w:hanging="360"/>
+      </w:pPr>
+      <w:rPr>
+        <w:rFonts w:ascii="Wingdings" w:hAnsi="Wingdings" w:hint="default"/>
+        <w:sz w:val="20"/>
+      </w:rPr>
+    </w:lvl>
+    <w:lvl w:ilvl="4" w:tentative="1">
+      <w:start w:val="1"/>
+      <w:numFmt w:val="bullet"/>
+      <w:lvlText w:val=""/>
+      <w:lvlJc w:val="left"/>
+      <w:pPr>
+        <w:tabs>
+          <w:tab w:val="num" w:pos="3600"/>
+        </w:tabs>
+        <w:ind w:left="3600" w:hanging="360"/>
+      </w:pPr>
+      <w:rPr>
+        <w:rFonts w:ascii="Wingdings" w:hAnsi="Wingdings" w:hint="default"/>
+        <w:sz w:val="20"/>
+      </w:rPr>
+    </w:lvl>
+    <w:lvl w:ilvl="5" w:tentative="1">
+      <w:start w:val="1"/>
+      <w:numFmt w:val="bullet"/>
+      <w:lvlText w:val=""/>
+      <w:lvlJc w:val="left"/>
+      <w:pPr>
+        <w:tabs>
+          <w:tab w:val="num" w:pos="4320"/>
+        </w:tabs>
+        <w:ind w:left="4320" w:hanging="360"/>
+      </w:pPr>
+      <w:rPr>
+        <w:rFonts w:ascii="Wingdings" w:hAnsi="Wingdings" w:hint="default"/>
+        <w:sz w:val="20"/>
+      </w:rPr>
+    </w:lvl>
+    <w:lvl w:ilvl="6" w:tentative="1">
+      <w:start w:val="1"/>
+      <w:numFmt w:val="bullet"/>
+      <w:lvlText w:val=""/>
+      <w:lvlJc w:val="left"/>
+      <w:pPr>
+        <w:tabs>
+          <w:tab w:val="num" w:pos="5040"/>
+        </w:tabs>
+        <w:ind w:left="5040" w:hanging="360"/>
+      </w:pPr>
+      <w:rPr>
+        <w:rFonts w:ascii="Wingdings" w:hAnsi="Wingdings" w:hint="default"/>
+        <w:sz w:val="20"/>
+      </w:rPr>
+    </w:lvl>
+    <w:lvl w:ilvl="7" w:tentative="1">
+      <w:start w:val="1"/>
+      <w:numFmt w:val="bullet"/>
+      <w:lvlText w:val=""/>
+      <w:lvlJc w:val="left"/>
+      <w:pPr>
+        <w:tabs>
+          <w:tab w:val="num" w:pos="5760"/>
+        </w:tabs>
+        <w:ind w:left="5760" w:hanging="360"/>
+      </w:pPr>
+      <w:rPr>
+        <w:rFonts w:ascii="Wingdings" w:hAnsi="Wingdings" w:hint="default"/>
+        <w:sz w:val="20"/>
+      </w:rPr>
+    </w:lvl>
+    <w:lvl w:ilvl="8" w:tentative="1">
+      <w:start w:val="1"/>
+      <w:numFmt w:val="bullet"/>
+      <w:lvlText w:val=""/>
+      <w:lvlJc w:val="left"/>
+      <w:pPr>
+        <w:tabs>
+          <w:tab w:val="num" w:pos="6480"/>
+        </w:tabs>
+        <w:ind w:left="6480" w:hanging="360"/>
+      </w:pPr>
+      <w:rPr>
+        <w:rFonts w:ascii="Wingdings" w:hAnsi="Wingdings" w:hint="default"/>
+        <w:sz w:val="20"/>
+      </w:rPr>
+    </w:lvl>
+  </w:abstractNum>
+  <w:abstractNum w:abstractNumId="19" w15:restartNumberingAfterBreak="0">
     <w:nsid w:val="5AFE0149"/>
     <w:multiLevelType w:val="multilevel"/>
     <w:tmpl w:val="15F6FB90"/>
@@ -4457,7 +6763,156 @@
       </w:pPr>
     </w:lvl>
   </w:abstractNum>
-  <w:abstractNum w:abstractNumId="15" w15:restartNumberingAfterBreak="0">
+  <w:abstractNum w:abstractNumId="20" w15:restartNumberingAfterBreak="0">
+    <w:nsid w:val="6E086A13"/>
+    <w:multiLevelType w:val="multilevel"/>
+    <w:tmpl w:val="4300BE52"/>
+    <w:lvl w:ilvl="0">
+      <w:start w:val="1"/>
+      <w:numFmt w:val="bullet"/>
+      <w:lvlText w:val=""/>
+      <w:lvlJc w:val="left"/>
+      <w:pPr>
+        <w:tabs>
+          <w:tab w:val="num" w:pos="720"/>
+        </w:tabs>
+        <w:ind w:left="720" w:hanging="360"/>
+      </w:pPr>
+      <w:rPr>
+        <w:rFonts w:ascii="Symbol" w:hAnsi="Symbol" w:hint="default"/>
+        <w:sz w:val="20"/>
+      </w:rPr>
+    </w:lvl>
+    <w:lvl w:ilvl="1">
+      <w:start w:val="1"/>
+      <w:numFmt w:val="bullet"/>
+      <w:lvlText w:val="o"/>
+      <w:lvlJc w:val="left"/>
+      <w:pPr>
+        <w:tabs>
+          <w:tab w:val="num" w:pos="1440"/>
+        </w:tabs>
+        <w:ind w:left="1440" w:hanging="360"/>
+      </w:pPr>
+      <w:rPr>
+        <w:rFonts w:ascii="Courier New" w:hAnsi="Courier New" w:hint="default"/>
+        <w:sz w:val="20"/>
+      </w:rPr>
+    </w:lvl>
+    <w:lvl w:ilvl="2" w:tentative="1">
+      <w:start w:val="1"/>
+      <w:numFmt w:val="bullet"/>
+      <w:lvlText w:val=""/>
+      <w:lvlJc w:val="left"/>
+      <w:pPr>
+        <w:tabs>
+          <w:tab w:val="num" w:pos="2160"/>
+        </w:tabs>
+        <w:ind w:left="2160" w:hanging="360"/>
+      </w:pPr>
+      <w:rPr>
+        <w:rFonts w:ascii="Wingdings" w:hAnsi="Wingdings" w:hint="default"/>
+        <w:sz w:val="20"/>
+      </w:rPr>
+    </w:lvl>
+    <w:lvl w:ilvl="3" w:tentative="1">
+      <w:start w:val="1"/>
+      <w:numFmt w:val="bullet"/>
+      <w:lvlText w:val=""/>
+      <w:lvlJc w:val="left"/>
+      <w:pPr>
+        <w:tabs>
+          <w:tab w:val="num" w:pos="2880"/>
+        </w:tabs>
+        <w:ind w:left="2880" w:hanging="360"/>
+      </w:pPr>
+      <w:rPr>
+        <w:rFonts w:ascii="Wingdings" w:hAnsi="Wingdings" w:hint="default"/>
+        <w:sz w:val="20"/>
+      </w:rPr>
+    </w:lvl>
+    <w:lvl w:ilvl="4" w:tentative="1">
+      <w:start w:val="1"/>
+      <w:numFmt w:val="bullet"/>
+      <w:lvlText w:val=""/>
+      <w:lvlJc w:val="left"/>
+      <w:pPr>
+        <w:tabs>
+          <w:tab w:val="num" w:pos="3600"/>
+        </w:tabs>
+        <w:ind w:left="3600" w:hanging="360"/>
+      </w:pPr>
+      <w:rPr>
+        <w:rFonts w:ascii="Wingdings" w:hAnsi="Wingdings" w:hint="default"/>
+        <w:sz w:val="20"/>
+      </w:rPr>
+    </w:lvl>
+    <w:lvl w:ilvl="5" w:tentative="1">
+      <w:start w:val="1"/>
+      <w:numFmt w:val="bullet"/>
+      <w:lvlText w:val=""/>
+      <w:lvlJc w:val="left"/>
+      <w:pPr>
+        <w:tabs>
+          <w:tab w:val="num" w:pos="4320"/>
+        </w:tabs>
+        <w:ind w:left="4320" w:hanging="360"/>
+      </w:pPr>
+      <w:rPr>
+        <w:rFonts w:ascii="Wingdings" w:hAnsi="Wingdings" w:hint="default"/>
+        <w:sz w:val="20"/>
+      </w:rPr>
+    </w:lvl>
+    <w:lvl w:ilvl="6" w:tentative="1">
+      <w:start w:val="1"/>
+      <w:numFmt w:val="bullet"/>
+      <w:lvlText w:val=""/>
+      <w:lvlJc w:val="left"/>
+      <w:pPr>
+        <w:tabs>
+          <w:tab w:val="num" w:pos="5040"/>
+        </w:tabs>
+        <w:ind w:left="5040" w:hanging="360"/>
+      </w:pPr>
+      <w:rPr>
+        <w:rFonts w:ascii="Wingdings" w:hAnsi="Wingdings" w:hint="default"/>
+        <w:sz w:val="20"/>
+      </w:rPr>
+    </w:lvl>
+    <w:lvl w:ilvl="7" w:tentative="1">
+      <w:start w:val="1"/>
+      <w:numFmt w:val="bullet"/>
+      <w:lvlText w:val=""/>
+      <w:lvlJc w:val="left"/>
+      <w:pPr>
+        <w:tabs>
+          <w:tab w:val="num" w:pos="5760"/>
+        </w:tabs>
+        <w:ind w:left="5760" w:hanging="360"/>
+      </w:pPr>
+      <w:rPr>
+        <w:rFonts w:ascii="Wingdings" w:hAnsi="Wingdings" w:hint="default"/>
+        <w:sz w:val="20"/>
+      </w:rPr>
+    </w:lvl>
+    <w:lvl w:ilvl="8" w:tentative="1">
+      <w:start w:val="1"/>
+      <w:numFmt w:val="bullet"/>
+      <w:lvlText w:val=""/>
+      <w:lvlJc w:val="left"/>
+      <w:pPr>
+        <w:tabs>
+          <w:tab w:val="num" w:pos="6480"/>
+        </w:tabs>
+        <w:ind w:left="6480" w:hanging="360"/>
+      </w:pPr>
+      <w:rPr>
+        <w:rFonts w:ascii="Wingdings" w:hAnsi="Wingdings" w:hint="default"/>
+        <w:sz w:val="20"/>
+      </w:rPr>
+    </w:lvl>
+  </w:abstractNum>
+  <w:abstractNum w:abstractNumId="21" w15:restartNumberingAfterBreak="0">
     <w:nsid w:val="74E26488"/>
     <w:multiLevelType w:val="multilevel"/>
     <w:tmpl w:val="FB0825CA"/>
@@ -4570,7 +7025,7 @@
       </w:pPr>
     </w:lvl>
   </w:abstractNum>
-  <w:abstractNum w:abstractNumId="16" w15:restartNumberingAfterBreak="0">
+  <w:abstractNum w:abstractNumId="22" w15:restartNumberingAfterBreak="0">
     <w:nsid w:val="77D74289"/>
     <w:multiLevelType w:val="multilevel"/>
     <w:tmpl w:val="6C382B26"/>
@@ -4719,7 +7174,7 @@
       </w:rPr>
     </w:lvl>
   </w:abstractNum>
-  <w:abstractNum w:abstractNumId="17" w15:restartNumberingAfterBreak="0">
+  <w:abstractNum w:abstractNumId="23" w15:restartNumberingAfterBreak="0">
     <w:nsid w:val="7A18333A"/>
     <w:multiLevelType w:val="multilevel"/>
     <w:tmpl w:val="ECF03ED8"/>
@@ -4868,7 +7323,156 @@
       </w:rPr>
     </w:lvl>
   </w:abstractNum>
-  <w:abstractNum w:abstractNumId="18" w15:restartNumberingAfterBreak="0">
+  <w:abstractNum w:abstractNumId="24" w15:restartNumberingAfterBreak="0">
+    <w:nsid w:val="7DD362C3"/>
+    <w:multiLevelType w:val="multilevel"/>
+    <w:tmpl w:val="625A7BE6"/>
+    <w:lvl w:ilvl="0">
+      <w:start w:val="1"/>
+      <w:numFmt w:val="bullet"/>
+      <w:lvlText w:val=""/>
+      <w:lvlJc w:val="left"/>
+      <w:pPr>
+        <w:tabs>
+          <w:tab w:val="num" w:pos="720"/>
+        </w:tabs>
+        <w:ind w:left="720" w:hanging="360"/>
+      </w:pPr>
+      <w:rPr>
+        <w:rFonts w:ascii="Symbol" w:hAnsi="Symbol" w:hint="default"/>
+        <w:sz w:val="20"/>
+      </w:rPr>
+    </w:lvl>
+    <w:lvl w:ilvl="1" w:tentative="1">
+      <w:start w:val="1"/>
+      <w:numFmt w:val="bullet"/>
+      <w:lvlText w:val="o"/>
+      <w:lvlJc w:val="left"/>
+      <w:pPr>
+        <w:tabs>
+          <w:tab w:val="num" w:pos="1440"/>
+        </w:tabs>
+        <w:ind w:left="1440" w:hanging="360"/>
+      </w:pPr>
+      <w:rPr>
+        <w:rFonts w:ascii="Courier New" w:hAnsi="Courier New" w:hint="default"/>
+        <w:sz w:val="20"/>
+      </w:rPr>
+    </w:lvl>
+    <w:lvl w:ilvl="2" w:tentative="1">
+      <w:start w:val="1"/>
+      <w:numFmt w:val="bullet"/>
+      <w:lvlText w:val=""/>
+      <w:lvlJc w:val="left"/>
+      <w:pPr>
+        <w:tabs>
+          <w:tab w:val="num" w:pos="2160"/>
+        </w:tabs>
+        <w:ind w:left="2160" w:hanging="360"/>
+      </w:pPr>
+      <w:rPr>
+        <w:rFonts w:ascii="Wingdings" w:hAnsi="Wingdings" w:hint="default"/>
+        <w:sz w:val="20"/>
+      </w:rPr>
+    </w:lvl>
+    <w:lvl w:ilvl="3" w:tentative="1">
+      <w:start w:val="1"/>
+      <w:numFmt w:val="bullet"/>
+      <w:lvlText w:val=""/>
+      <w:lvlJc w:val="left"/>
+      <w:pPr>
+        <w:tabs>
+          <w:tab w:val="num" w:pos="2880"/>
+        </w:tabs>
+        <w:ind w:left="2880" w:hanging="360"/>
+      </w:pPr>
+      <w:rPr>
+        <w:rFonts w:ascii="Wingdings" w:hAnsi="Wingdings" w:hint="default"/>
+        <w:sz w:val="20"/>
+      </w:rPr>
+    </w:lvl>
+    <w:lvl w:ilvl="4" w:tentative="1">
+      <w:start w:val="1"/>
+      <w:numFmt w:val="bullet"/>
+      <w:lvlText w:val=""/>
+      <w:lvlJc w:val="left"/>
+      <w:pPr>
+        <w:tabs>
+          <w:tab w:val="num" w:pos="3600"/>
+        </w:tabs>
+        <w:ind w:left="3600" w:hanging="360"/>
+      </w:pPr>
+      <w:rPr>
+        <w:rFonts w:ascii="Wingdings" w:hAnsi="Wingdings" w:hint="default"/>
+        <w:sz w:val="20"/>
+      </w:rPr>
+    </w:lvl>
+    <w:lvl w:ilvl="5" w:tentative="1">
+      <w:start w:val="1"/>
+      <w:numFmt w:val="bullet"/>
+      <w:lvlText w:val=""/>
+      <w:lvlJc w:val="left"/>
+      <w:pPr>
+        <w:tabs>
+          <w:tab w:val="num" w:pos="4320"/>
+        </w:tabs>
+        <w:ind w:left="4320" w:hanging="360"/>
+      </w:pPr>
+      <w:rPr>
+        <w:rFonts w:ascii="Wingdings" w:hAnsi="Wingdings" w:hint="default"/>
+        <w:sz w:val="20"/>
+      </w:rPr>
+    </w:lvl>
+    <w:lvl w:ilvl="6" w:tentative="1">
+      <w:start w:val="1"/>
+      <w:numFmt w:val="bullet"/>
+      <w:lvlText w:val=""/>
+      <w:lvlJc w:val="left"/>
+      <w:pPr>
+        <w:tabs>
+          <w:tab w:val="num" w:pos="5040"/>
+        </w:tabs>
+        <w:ind w:left="5040" w:hanging="360"/>
+      </w:pPr>
+      <w:rPr>
+        <w:rFonts w:ascii="Wingdings" w:hAnsi="Wingdings" w:hint="default"/>
+        <w:sz w:val="20"/>
+      </w:rPr>
+    </w:lvl>
+    <w:lvl w:ilvl="7" w:tentative="1">
+      <w:start w:val="1"/>
+      <w:numFmt w:val="bullet"/>
+      <w:lvlText w:val=""/>
+      <w:lvlJc w:val="left"/>
+      <w:pPr>
+        <w:tabs>
+          <w:tab w:val="num" w:pos="5760"/>
+        </w:tabs>
+        <w:ind w:left="5760" w:hanging="360"/>
+      </w:pPr>
+      <w:rPr>
+        <w:rFonts w:ascii="Wingdings" w:hAnsi="Wingdings" w:hint="default"/>
+        <w:sz w:val="20"/>
+      </w:rPr>
+    </w:lvl>
+    <w:lvl w:ilvl="8" w:tentative="1">
+      <w:start w:val="1"/>
+      <w:numFmt w:val="bullet"/>
+      <w:lvlText w:val=""/>
+      <w:lvlJc w:val="left"/>
+      <w:pPr>
+        <w:tabs>
+          <w:tab w:val="num" w:pos="6480"/>
+        </w:tabs>
+        <w:ind w:left="6480" w:hanging="360"/>
+      </w:pPr>
+      <w:rPr>
+        <w:rFonts w:ascii="Wingdings" w:hAnsi="Wingdings" w:hint="default"/>
+        <w:sz w:val="20"/>
+      </w:rPr>
+    </w:lvl>
+  </w:abstractNum>
+  <w:abstractNum w:abstractNumId="25" w15:restartNumberingAfterBreak="0">
     <w:nsid w:val="7E0A1142"/>
     <w:multiLevelType w:val="multilevel"/>
     <w:tmpl w:val="7E028C82"/>
@@ -5018,61 +7622,82 @@
     </w:lvl>
   </w:abstractNum>
   <w:num w:numId="1">
-    <w:abstractNumId w:val="3"/>
+    <w:abstractNumId w:val="5"/>
   </w:num>
   <w:num w:numId="2">
-    <w:abstractNumId w:val="17"/>
+    <w:abstractNumId w:val="23"/>
   </w:num>
   <w:num w:numId="3">
-    <w:abstractNumId w:val="8"/>
+    <w:abstractNumId w:val="10"/>
   </w:num>
   <w:num w:numId="4">
     <w:abstractNumId w:val="0"/>
   </w:num>
   <w:num w:numId="5">
+    <w:abstractNumId w:val="17"/>
+  </w:num>
+  <w:num w:numId="6">
+    <w:abstractNumId w:val="12"/>
+  </w:num>
+  <w:num w:numId="7">
+    <w:abstractNumId w:val="25"/>
+  </w:num>
+  <w:num w:numId="8">
+    <w:abstractNumId w:val="21"/>
+  </w:num>
+  <w:num w:numId="9">
+    <w:abstractNumId w:val="3"/>
+  </w:num>
+  <w:num w:numId="10">
+    <w:abstractNumId w:val="9"/>
+  </w:num>
+  <w:num w:numId="11">
+    <w:abstractNumId w:val="22"/>
+  </w:num>
+  <w:num w:numId="12">
+    <w:abstractNumId w:val="19"/>
+  </w:num>
+  <w:num w:numId="13">
     <w:abstractNumId w:val="13"/>
   </w:num>
-  <w:num w:numId="6">
-    <w:abstractNumId w:val="9"/>
+  <w:num w:numId="14">
+    <w:abstractNumId w:val="15"/>
   </w:num>
-  <w:num w:numId="7">
+  <w:num w:numId="15">
+    <w:abstractNumId w:val="6"/>
+  </w:num>
+  <w:num w:numId="16">
+    <w:abstractNumId w:val="14"/>
+  </w:num>
+  <w:num w:numId="17">
+    <w:abstractNumId w:val="8"/>
+  </w:num>
+  <w:num w:numId="18">
+    <w:abstractNumId w:val="7"/>
+  </w:num>
+  <w:num w:numId="19">
+    <w:abstractNumId w:val="4"/>
+  </w:num>
+  <w:num w:numId="20">
+    <w:abstractNumId w:val="24"/>
+  </w:num>
+  <w:num w:numId="21">
+    <w:abstractNumId w:val="16"/>
+  </w:num>
+  <w:num w:numId="22">
+    <w:abstractNumId w:val="11"/>
+  </w:num>
+  <w:num w:numId="23">
     <w:abstractNumId w:val="18"/>
   </w:num>
-  <w:num w:numId="8">
-    <w:abstractNumId w:val="15"/>
+  <w:num w:numId="24">
+    <w:abstractNumId w:val="2"/>
   </w:num>
-  <w:num w:numId="9">
+  <w:num w:numId="25">
     <w:abstractNumId w:val="1"/>
   </w:num>
-  <w:num w:numId="10">
-    <w:abstractNumId w:val="7"/>
-  </w:num>
-  <w:num w:numId="11">
-    <w:abstractNumId w:val="16"/>
-  </w:num>
-  <w:num w:numId="12">
-    <w:abstractNumId w:val="14"/>
-  </w:num>
-  <w:num w:numId="13">
-    <w:abstractNumId w:val="10"/>
-  </w:num>
-  <w:num w:numId="14">
-    <w:abstractNumId w:val="12"/>
-  </w:num>
-  <w:num w:numId="15">
-    <w:abstractNumId w:val="4"/>
-  </w:num>
-  <w:num w:numId="16">
-    <w:abstractNumId w:val="11"/>
-  </w:num>
-  <w:num w:numId="17">
-    <w:abstractNumId w:val="6"/>
-  </w:num>
-  <w:num w:numId="18">
-    <w:abstractNumId w:val="5"/>
-  </w:num>
-  <w:num w:numId="19">
-    <w:abstractNumId w:val="2"/>
+  <w:num w:numId="26">
+    <w:abstractNumId w:val="20"/>
   </w:num>
 </w:numbering>
 </file>
@@ -5754,6 +8379,41 @@
     <w:basedOn w:val="DefaultParagraphFont"/>
     <w:rsid w:val="007105B0"/>
   </w:style>
+  <w:style w:type="character" w:customStyle="1" w:styleId="ng-tns-c3089768999-247">
+    <w:name w:val="ng-tns-c3089768999-247"/>
+    <w:basedOn w:val="DefaultParagraphFont"/>
+    <w:rsid w:val="00B07FBD"/>
+  </w:style>
+  <w:style w:type="character" w:customStyle="1" w:styleId="hljs-attr">
+    <w:name w:val="hljs-attr"/>
+    <w:basedOn w:val="DefaultParagraphFont"/>
+    <w:rsid w:val="00B07FBD"/>
+  </w:style>
+  <w:style w:type="character" w:customStyle="1" w:styleId="ng-tns-c3089768999-248">
+    <w:name w:val="ng-tns-c3089768999-248"/>
+    <w:basedOn w:val="DefaultParagraphFont"/>
+    <w:rsid w:val="00B07FBD"/>
+  </w:style>
+  <w:style w:type="character" w:customStyle="1" w:styleId="hljs-keyword">
+    <w:name w:val="hljs-keyword"/>
+    <w:basedOn w:val="DefaultParagraphFont"/>
+    <w:rsid w:val="00B07FBD"/>
+  </w:style>
+  <w:style w:type="character" w:customStyle="1" w:styleId="ng-tns-c3089768999-249">
+    <w:name w:val="ng-tns-c3089768999-249"/>
+    <w:basedOn w:val="DefaultParagraphFont"/>
+    <w:rsid w:val="00B07FBD"/>
+  </w:style>
+  <w:style w:type="character" w:customStyle="1" w:styleId="ng-tns-c3089768999-250">
+    <w:name w:val="ng-tns-c3089768999-250"/>
+    <w:basedOn w:val="DefaultParagraphFont"/>
+    <w:rsid w:val="00B07FBD"/>
+  </w:style>
+  <w:style w:type="character" w:customStyle="1" w:styleId="ng-tns-c3089768999-251">
+    <w:name w:val="ng-tns-c3089768999-251"/>
+    <w:basedOn w:val="DefaultParagraphFont"/>
+    <w:rsid w:val="00B07FBD"/>
+  </w:style>
 </w:styles>
 </file>
 

</xml_diff>